<commit_message>
Changement document Etudiant -> Nom de la personne
</commit_message>
<xml_diff>
--- a/TP2_Flask_Kanban_GitHub.docx
+++ b/TP2_Flask_Kanban_GitHub.docx
@@ -304,7 +304,7 @@
               </wp:inline>
             </w:drawing>
           </mc:Choice>
-          <mc:Fallback xmlns:oel="http://schemas.microsoft.com/office/2019/extlst" xmlns:w16du="http://schemas.microsoft.com/office/word/2023/wordml/word16du" xmlns:w16sdtfl="http://schemas.microsoft.com/office/word/2024/wordml/sdtformatlock" xmlns:a="http://schemas.openxmlformats.org/drawingml/2006/main">
+          <mc:Fallback xmlns:a="http://schemas.openxmlformats.org/drawingml/2006/main" xmlns:w16sdtfl="http://schemas.microsoft.com/office/word/2024/wordml/sdtformatlock" xmlns:w16du="http://schemas.microsoft.com/office/word/2023/wordml/word16du" xmlns:oel="http://schemas.microsoft.com/office/2019/extlst">
             <w:pict>
               <v:group id="Group 50839" style="width:475.25pt;height:0.5pt;mso-position-horizontal-relative:char;mso-position-vertical-relative:line" coordsize="60356,63">
                 <v:shape id="Shape 4814" style="position:absolute;width:60356;height:0;left:0;top:0;" coordsize="6035675,0" path="m6035675,0l0,0">
@@ -581,7 +581,7 @@
               </wp:inline>
             </w:drawing>
           </mc:Choice>
-          <mc:Fallback xmlns:oel="http://schemas.microsoft.com/office/2019/extlst" xmlns:w16du="http://schemas.microsoft.com/office/word/2023/wordml/word16du" xmlns:w16sdtfl="http://schemas.microsoft.com/office/word/2024/wordml/sdtformatlock" xmlns:a="http://schemas.openxmlformats.org/drawingml/2006/main">
+          <mc:Fallback xmlns:a="http://schemas.openxmlformats.org/drawingml/2006/main" xmlns:w16sdtfl="http://schemas.microsoft.com/office/word/2024/wordml/sdtformatlock" xmlns:w16du="http://schemas.microsoft.com/office/word/2023/wordml/word16du" xmlns:oel="http://schemas.microsoft.com/office/2019/extlst">
             <w:pict>
               <v:group id="Group 50840" style="width:475.25pt;height:0.5pt;mso-position-horizontal-relative:char;mso-position-vertical-relative:line" coordsize="60356,63">
                 <v:shape id="Shape 4815" style="position:absolute;width:60356;height:0;left:0;top:0;" coordsize="6035675,0" path="m6035675,0l0,0">
@@ -1874,7 +1874,7 @@
               </wp:inline>
             </w:drawing>
           </mc:Choice>
-          <mc:Fallback xmlns:oel="http://schemas.microsoft.com/office/2019/extlst" xmlns:w16du="http://schemas.microsoft.com/office/word/2023/wordml/word16du" xmlns:w16sdtfl="http://schemas.microsoft.com/office/word/2024/wordml/sdtformatlock" xmlns:a="http://schemas.openxmlformats.org/drawingml/2006/main">
+          <mc:Fallback xmlns:a="http://schemas.openxmlformats.org/drawingml/2006/main" xmlns:w16sdtfl="http://schemas.microsoft.com/office/word/2024/wordml/sdtformatlock" xmlns:w16du="http://schemas.microsoft.com/office/word/2023/wordml/word16du" xmlns:oel="http://schemas.microsoft.com/office/2019/extlst">
             <w:pict>
               <v:group id="Group 45330" style="width:475.25pt;height:0.5pt;mso-position-horizontal-relative:char;mso-position-vertical-relative:line" coordsize="60356,63">
                 <v:shape id="Shape 4951" style="position:absolute;width:60356;height:0;left:0;top:0;" coordsize="6035675,0" path="m6035675,0l0,0">
@@ -2510,7 +2510,7 @@
               </wp:inline>
             </w:drawing>
           </mc:Choice>
-          <mc:Fallback xmlns:oel="http://schemas.microsoft.com/office/2019/extlst" xmlns:w16du="http://schemas.microsoft.com/office/word/2023/wordml/word16du" xmlns:w16sdtfl="http://schemas.microsoft.com/office/word/2024/wordml/sdtformatlock" xmlns:a="http://schemas.openxmlformats.org/drawingml/2006/main">
+          <mc:Fallback xmlns:a="http://schemas.openxmlformats.org/drawingml/2006/main" xmlns:w16sdtfl="http://schemas.microsoft.com/office/word/2024/wordml/sdtformatlock" xmlns:w16du="http://schemas.microsoft.com/office/word/2023/wordml/word16du" xmlns:oel="http://schemas.microsoft.com/office/2019/extlst">
             <w:pict>
               <v:group id="Group 45331" style="width:475.25pt;height:0.5pt;mso-position-horizontal-relative:char;mso-position-vertical-relative:line" coordsize="60356,63">
                 <v:shape id="Shape 4952" style="position:absolute;width:60356;height:0;left:0;top:0;" coordsize="6035675,0" path="m6035675,0l0,0">
@@ -2608,6 +2608,9 @@
         <w:jc w:val="both"/>
       </w:pPr>
       <w:r>
+        <w:rPr>
+          <w:noProof/>
+        </w:rPr>
         <w:drawing>
           <wp:inline distT="0" distB="0" distL="0" distR="0" wp14:anchorId="2EA7FF96" wp14:editId="32ECD381">
             <wp:extent cx="6043295" cy="5152390"/>
@@ -2690,6 +2693,7 @@
       </w:pPr>
       <w:r>
         <w:rPr>
+          <w:noProof/>
           <w:lang w:val="fr-FR"/>
         </w:rPr>
         <w:lastRenderedPageBreak/>
@@ -2864,7 +2868,7 @@
               </wp:inline>
             </w:drawing>
           </mc:Choice>
-          <mc:Fallback xmlns:oel="http://schemas.microsoft.com/office/2019/extlst" xmlns:w16du="http://schemas.microsoft.com/office/word/2023/wordml/word16du" xmlns:w16sdtfl="http://schemas.microsoft.com/office/word/2024/wordml/sdtformatlock" xmlns:a="http://schemas.openxmlformats.org/drawingml/2006/main">
+          <mc:Fallback xmlns:a="http://schemas.openxmlformats.org/drawingml/2006/main" xmlns:w16sdtfl="http://schemas.microsoft.com/office/word/2024/wordml/sdtformatlock" xmlns:w16du="http://schemas.microsoft.com/office/word/2023/wordml/word16du" xmlns:oel="http://schemas.microsoft.com/office/2019/extlst">
             <w:pict>
               <v:group id="Group 55004" style="width:475.25pt;height:0.5pt;mso-position-horizontal-relative:char;mso-position-vertical-relative:line" coordsize="60356,63">
                 <v:shape id="Shape 5192" style="position:absolute;width:60356;height:0;left:0;top:0;" coordsize="6035675,0" path="m6035675,0l0,0">
@@ -3861,7 +3865,7 @@
               </wp:inline>
             </w:drawing>
           </mc:Choice>
-          <mc:Fallback xmlns:oel="http://schemas.microsoft.com/office/2019/extlst" xmlns:w16du="http://schemas.microsoft.com/office/word/2023/wordml/word16du" xmlns:w16sdtfl="http://schemas.microsoft.com/office/word/2024/wordml/sdtformatlock" xmlns:a="http://schemas.openxmlformats.org/drawingml/2006/main">
+          <mc:Fallback xmlns:a="http://schemas.openxmlformats.org/drawingml/2006/main" xmlns:w16sdtfl="http://schemas.microsoft.com/office/word/2024/wordml/sdtformatlock" xmlns:w16du="http://schemas.microsoft.com/office/word/2023/wordml/word16du" xmlns:oel="http://schemas.microsoft.com/office/2019/extlst">
             <w:pict>
               <v:group id="Group 55005" style="width:475.25pt;height:0.5pt;mso-position-horizontal-relative:char;mso-position-vertical-relative:line" coordsize="60356,63">
                 <v:shape id="Shape 5193" style="position:absolute;width:60356;height:0;left:0;top:0;" coordsize="6035675,0" path="m6035675,0l0,0">
@@ -4320,7 +4324,7 @@
               <w:rPr>
                 <w:sz w:val="20"/>
               </w:rPr>
-              <w:t>Étudiant A</w:t>
+              <w:t>Adrien</w:t>
             </w:r>
           </w:p>
         </w:tc>
@@ -4455,7 +4459,13 @@
               <w:rPr>
                 <w:sz w:val="20"/>
               </w:rPr>
-              <w:t>Étudiant A</w:t>
+              <w:t>A</w:t>
+            </w:r>
+            <w:r>
+              <w:rPr>
+                <w:sz w:val="20"/>
+              </w:rPr>
+              <w:t>drien</w:t>
             </w:r>
           </w:p>
         </w:tc>
@@ -4578,7 +4588,7 @@
               <w:rPr>
                 <w:sz w:val="20"/>
               </w:rPr>
-              <w:t>Étudiant A</w:t>
+              <w:t>Adrien</w:t>
             </w:r>
           </w:p>
         </w:tc>
@@ -4977,7 +4987,7 @@
               <w:rPr>
                 <w:sz w:val="20"/>
               </w:rPr>
-              <w:t>Étudiant A</w:t>
+              <w:t>Adrien</w:t>
             </w:r>
           </w:p>
         </w:tc>
@@ -5119,7 +5129,7 @@
               <w:rPr>
                 <w:sz w:val="20"/>
               </w:rPr>
-              <w:t>Étudiant A</w:t>
+              <w:t>Adrien</w:t>
             </w:r>
           </w:p>
         </w:tc>
@@ -5265,7 +5275,7 @@
               <w:rPr>
                 <w:sz w:val="20"/>
               </w:rPr>
-              <w:t>Étudiant A</w:t>
+              <w:t>Adrien</w:t>
             </w:r>
           </w:p>
         </w:tc>
@@ -5388,7 +5398,7 @@
               <w:rPr>
                 <w:sz w:val="20"/>
               </w:rPr>
-              <w:t>Étudiant B</w:t>
+              <w:t>Adam</w:t>
             </w:r>
           </w:p>
         </w:tc>
@@ -5523,7 +5533,7 @@
               <w:rPr>
                 <w:sz w:val="20"/>
               </w:rPr>
-              <w:t>Étudiant B</w:t>
+              <w:t>Adam</w:t>
             </w:r>
           </w:p>
         </w:tc>
@@ -5665,7 +5675,7 @@
               <w:rPr>
                 <w:sz w:val="20"/>
               </w:rPr>
-              <w:t>Étudiant B</w:t>
+              <w:t>Adam</w:t>
             </w:r>
           </w:p>
         </w:tc>
@@ -5819,7 +5829,7 @@
               <w:rPr>
                 <w:sz w:val="20"/>
               </w:rPr>
-              <w:t>Étudiant B</w:t>
+              <w:t>Adam</w:t>
             </w:r>
           </w:p>
         </w:tc>
@@ -5947,10 +5957,7 @@
           </w:tcPr>
           <w:p>
             <w:r>
-              <w:rPr>
-                <w:sz w:val="20"/>
-              </w:rPr>
-              <w:t>Étudiant C</w:t>
+              <w:t>Minh-Tam</w:t>
             </w:r>
           </w:p>
         </w:tc>
@@ -6104,7 +6111,7 @@
               <w:rPr>
                 <w:sz w:val="20"/>
               </w:rPr>
-              <w:t>Étudiant C</w:t>
+              <w:t>Minh-Tam</w:t>
             </w:r>
           </w:p>
         </w:tc>
@@ -6254,7 +6261,7 @@
               <w:rPr>
                 <w:sz w:val="20"/>
               </w:rPr>
-              <w:t>Étudiant C</w:t>
+              <w:t>Minh-Tam</w:t>
             </w:r>
           </w:p>
         </w:tc>
@@ -6389,7 +6396,7 @@
               <w:rPr>
                 <w:sz w:val="20"/>
               </w:rPr>
-              <w:t>Étudiant D</w:t>
+              <w:t>Lokman</w:t>
             </w:r>
           </w:p>
         </w:tc>
@@ -6528,7 +6535,7 @@
               <w:rPr>
                 <w:sz w:val="20"/>
               </w:rPr>
-              <w:t>Étudiant D</w:t>
+              <w:t>Lokman</w:t>
             </w:r>
           </w:p>
         </w:tc>
@@ -6671,7 +6678,7 @@
               <w:rPr>
                 <w:sz w:val="20"/>
               </w:rPr>
-              <w:t>Étudiant D</w:t>
+              <w:t>Lokman</w:t>
             </w:r>
           </w:p>
         </w:tc>
@@ -7050,7 +7057,7 @@
               </wp:inline>
             </w:drawing>
           </mc:Choice>
-          <mc:Fallback xmlns:oel="http://schemas.microsoft.com/office/2019/extlst" xmlns:w16du="http://schemas.microsoft.com/office/word/2023/wordml/word16du" xmlns:w16sdtfl="http://schemas.microsoft.com/office/word/2024/wordml/sdtformatlock" xmlns:a="http://schemas.openxmlformats.org/drawingml/2006/main">
+          <mc:Fallback xmlns:a="http://schemas.openxmlformats.org/drawingml/2006/main" xmlns:w16sdtfl="http://schemas.microsoft.com/office/word/2024/wordml/sdtformatlock" xmlns:w16du="http://schemas.microsoft.com/office/word/2023/wordml/word16du" xmlns:oel="http://schemas.microsoft.com/office/2019/extlst">
             <w:pict>
               <v:group id="Group 59284" style="width:475.25pt;height:0.5pt;mso-position-horizontal-relative:char;mso-position-vertical-relative:line" coordsize="60356,63">
                 <v:shape id="Shape 5645" style="position:absolute;width:60356;height:0;left:0;top:0;" coordsize="6035675,0" path="m6035675,0l0,0">
@@ -7689,7 +7696,7 @@
               </wp:inline>
             </w:drawing>
           </mc:Choice>
-          <mc:Fallback xmlns:oel="http://schemas.microsoft.com/office/2019/extlst" xmlns:w16du="http://schemas.microsoft.com/office/word/2023/wordml/word16du" xmlns:w16sdtfl="http://schemas.microsoft.com/office/word/2024/wordml/sdtformatlock" xmlns:a="http://schemas.openxmlformats.org/drawingml/2006/main">
+          <mc:Fallback xmlns:a="http://schemas.openxmlformats.org/drawingml/2006/main" xmlns:w16sdtfl="http://schemas.microsoft.com/office/word/2024/wordml/sdtformatlock" xmlns:w16du="http://schemas.microsoft.com/office/word/2023/wordml/word16du" xmlns:oel="http://schemas.microsoft.com/office/2019/extlst">
             <w:pict>
               <v:group id="Group 45030" style="width:475.25pt;height:0.5pt;mso-position-horizontal-relative:char;mso-position-vertical-relative:line" coordsize="60356,63">
                 <v:shape id="Shape 5755" style="position:absolute;width:60356;height:0;left:0;top:0;" coordsize="6035675,0" path="m6035675,0l0,0">
@@ -7894,7 +7901,7 @@
               </wp:inline>
             </w:drawing>
           </mc:Choice>
-          <mc:Fallback xmlns:oel="http://schemas.microsoft.com/office/2019/extlst" xmlns:w16du="http://schemas.microsoft.com/office/word/2023/wordml/word16du" xmlns:w16sdtfl="http://schemas.microsoft.com/office/word/2024/wordml/sdtformatlock" xmlns:a="http://schemas.openxmlformats.org/drawingml/2006/main">
+          <mc:Fallback xmlns:a="http://schemas.openxmlformats.org/drawingml/2006/main" xmlns:w16sdtfl="http://schemas.microsoft.com/office/word/2024/wordml/sdtformatlock" xmlns:w16du="http://schemas.microsoft.com/office/word/2023/wordml/word16du" xmlns:oel="http://schemas.microsoft.com/office/2019/extlst">
             <w:pict>
               <v:group id="Group 45031" style="width:475.25pt;height:0.5pt;mso-position-horizontal-relative:char;mso-position-vertical-relative:line" coordsize="60356,63">
                 <v:shape id="Shape 5756" style="position:absolute;width:60356;height:0;left:0;top:0;" coordsize="6035675,0" path="m6035675,0l0,0">
@@ -8197,7 +8204,7 @@
               </wp:inline>
             </w:drawing>
           </mc:Choice>
-          <mc:Fallback xmlns:oel="http://schemas.microsoft.com/office/2019/extlst" xmlns:w16du="http://schemas.microsoft.com/office/word/2023/wordml/word16du" xmlns:w16sdtfl="http://schemas.microsoft.com/office/word/2024/wordml/sdtformatlock" xmlns:a="http://schemas.openxmlformats.org/drawingml/2006/main">
+          <mc:Fallback xmlns:a="http://schemas.openxmlformats.org/drawingml/2006/main" xmlns:w16sdtfl="http://schemas.microsoft.com/office/word/2024/wordml/sdtformatlock" xmlns:w16du="http://schemas.microsoft.com/office/word/2023/wordml/word16du" xmlns:oel="http://schemas.microsoft.com/office/2019/extlst">
             <w:pict>
               <v:group id="Group 53945" style="width:475.25pt;height:0.5pt;mso-position-horizontal-relative:char;mso-position-vertical-relative:line" coordsize="60356,63">
                 <v:shape id="Shape 5879" style="position:absolute;width:60356;height:0;left:0;top:0;" coordsize="6035675,0" path="m6035675,0l0,0">
@@ -8453,7 +8460,7 @@
               </wp:inline>
             </w:drawing>
           </mc:Choice>
-          <mc:Fallback xmlns:oel="http://schemas.microsoft.com/office/2019/extlst" xmlns:w16du="http://schemas.microsoft.com/office/word/2023/wordml/word16du" xmlns:w16sdtfl="http://schemas.microsoft.com/office/word/2024/wordml/sdtformatlock" xmlns:a="http://schemas.openxmlformats.org/drawingml/2006/main">
+          <mc:Fallback xmlns:a="http://schemas.openxmlformats.org/drawingml/2006/main" xmlns:w16sdtfl="http://schemas.microsoft.com/office/word/2024/wordml/sdtformatlock" xmlns:w16du="http://schemas.microsoft.com/office/word/2023/wordml/word16du" xmlns:oel="http://schemas.microsoft.com/office/2019/extlst">
             <w:pict>
               <v:group id="Group 53946" style="width:475.25pt;height:0.5pt;mso-position-horizontal-relative:char;mso-position-vertical-relative:line" coordsize="60356,63">
                 <v:shape id="Shape 5880" style="position:absolute;width:60356;height:0;left:0;top:0;" coordsize="6035675,0" path="m6035675,0l0,0">
@@ -8689,7 +8696,7 @@
               </wp:inline>
             </w:drawing>
           </mc:Choice>
-          <mc:Fallback xmlns:oel="http://schemas.microsoft.com/office/2019/extlst" xmlns:w16du="http://schemas.microsoft.com/office/word/2023/wordml/word16du" xmlns:w16sdtfl="http://schemas.microsoft.com/office/word/2024/wordml/sdtformatlock" xmlns:a="http://schemas.openxmlformats.org/drawingml/2006/main">
+          <mc:Fallback xmlns:a="http://schemas.openxmlformats.org/drawingml/2006/main" xmlns:w16sdtfl="http://schemas.microsoft.com/office/word/2024/wordml/sdtformatlock" xmlns:w16du="http://schemas.microsoft.com/office/word/2023/wordml/word16du" xmlns:oel="http://schemas.microsoft.com/office/2019/extlst">
             <w:pict>
               <v:group id="Group 53947" style="width:475.25pt;height:0.5pt;mso-position-horizontal-relative:char;mso-position-vertical-relative:line" coordsize="60356,63">
                 <v:shape id="Shape 5881" style="position:absolute;width:60356;height:0;left:0;top:0;" coordsize="6035675,0" path="m6035675,0l0,0">
@@ -10108,7 +10115,7 @@
               </wp:inline>
             </w:drawing>
           </mc:Choice>
-          <mc:Fallback xmlns:oel="http://schemas.microsoft.com/office/2019/extlst" xmlns:w16du="http://schemas.microsoft.com/office/word/2023/wordml/word16du" xmlns:w16sdtfl="http://schemas.microsoft.com/office/word/2024/wordml/sdtformatlock" xmlns:a="http://schemas.openxmlformats.org/drawingml/2006/main">
+          <mc:Fallback xmlns:a="http://schemas.openxmlformats.org/drawingml/2006/main" xmlns:w16sdtfl="http://schemas.microsoft.com/office/word/2024/wordml/sdtformatlock" xmlns:w16du="http://schemas.microsoft.com/office/word/2023/wordml/word16du" xmlns:oel="http://schemas.microsoft.com/office/2019/extlst">
             <w:pict>
               <v:group id="Group 45149" style="width:475.25pt;height:0.5pt;mso-position-horizontal-relative:char;mso-position-vertical-relative:line" coordsize="60356,63">
                 <v:shape id="Shape 6195" style="position:absolute;width:60356;height:0;left:0;top:0;" coordsize="6035675,0" path="m6035675,0l0,0">
@@ -10431,7 +10438,7 @@
               </wp:inline>
             </w:drawing>
           </mc:Choice>
-          <mc:Fallback xmlns:oel="http://schemas.microsoft.com/office/2019/extlst" xmlns:w16du="http://schemas.microsoft.com/office/word/2023/wordml/word16du" xmlns:w16sdtfl="http://schemas.microsoft.com/office/word/2024/wordml/sdtformatlock" xmlns:a="http://schemas.openxmlformats.org/drawingml/2006/main">
+          <mc:Fallback xmlns:a="http://schemas.openxmlformats.org/drawingml/2006/main" xmlns:w16sdtfl="http://schemas.microsoft.com/office/word/2024/wordml/sdtformatlock" xmlns:w16du="http://schemas.microsoft.com/office/word/2023/wordml/word16du" xmlns:oel="http://schemas.microsoft.com/office/2019/extlst">
             <w:pict>
               <v:group id="Group 51696" style="width:475.25pt;height:0.5pt;mso-position-horizontal-relative:char;mso-position-vertical-relative:line" coordsize="60356,63">
                 <v:shape id="Shape 6319" style="position:absolute;width:60356;height:0;left:0;top:0;" coordsize="6035675,0" path="m6035675,0l0,0">
@@ -12203,7 +12210,7 @@
               </wp:inline>
             </w:drawing>
           </mc:Choice>
-          <mc:Fallback xmlns:oel="http://schemas.microsoft.com/office/2019/extlst" xmlns:w16du="http://schemas.microsoft.com/office/word/2023/wordml/word16du" xmlns:w16sdtfl="http://schemas.microsoft.com/office/word/2024/wordml/sdtformatlock" xmlns:a="http://schemas.openxmlformats.org/drawingml/2006/main">
+          <mc:Fallback xmlns:a="http://schemas.openxmlformats.org/drawingml/2006/main" xmlns:w16sdtfl="http://schemas.microsoft.com/office/word/2024/wordml/sdtformatlock" xmlns:w16du="http://schemas.microsoft.com/office/word/2023/wordml/word16du" xmlns:oel="http://schemas.microsoft.com/office/2019/extlst">
             <w:pict>
               <v:group id="Group 57263" style="width:475.25pt;height:0.5pt;mso-position-horizontal-relative:char;mso-position-vertical-relative:line" coordsize="60356,63">
                 <v:shape id="Shape 6684" style="position:absolute;width:60356;height:0;left:0;top:0;" coordsize="6035675,0" path="m6035675,0l0,0">
@@ -12494,7 +12501,7 @@
               </wp:inline>
             </w:drawing>
           </mc:Choice>
-          <mc:Fallback xmlns:oel="http://schemas.microsoft.com/office/2019/extlst" xmlns:w16du="http://schemas.microsoft.com/office/word/2023/wordml/word16du" xmlns:w16sdtfl="http://schemas.microsoft.com/office/word/2024/wordml/sdtformatlock" xmlns:a="http://schemas.openxmlformats.org/drawingml/2006/main">
+          <mc:Fallback xmlns:a="http://schemas.openxmlformats.org/drawingml/2006/main" xmlns:w16sdtfl="http://schemas.microsoft.com/office/word/2024/wordml/sdtformatlock" xmlns:w16du="http://schemas.microsoft.com/office/word/2023/wordml/word16du" xmlns:oel="http://schemas.microsoft.com/office/2019/extlst">
             <w:pict>
               <v:group id="Group 59971" style="width:475.25pt;height:0.5pt;mso-position-horizontal-relative:char;mso-position-vertical-relative:line" coordsize="60356,63">
                 <v:shape id="Shape 6807" style="position:absolute;width:60356;height:0;left:0;top:0;" coordsize="6035675,0" path="m6035675,0l0,0">
@@ -13196,7 +13203,7 @@
               </wp:inline>
             </w:drawing>
           </mc:Choice>
-          <mc:Fallback xmlns:oel="http://schemas.microsoft.com/office/2019/extlst" xmlns:w16du="http://schemas.microsoft.com/office/word/2023/wordml/word16du" xmlns:w16sdtfl="http://schemas.microsoft.com/office/word/2024/wordml/sdtformatlock" xmlns:a="http://schemas.openxmlformats.org/drawingml/2006/main">
+          <mc:Fallback xmlns:a="http://schemas.openxmlformats.org/drawingml/2006/main" xmlns:w16sdtfl="http://schemas.microsoft.com/office/word/2024/wordml/sdtformatlock" xmlns:w16du="http://schemas.microsoft.com/office/word/2023/wordml/word16du" xmlns:oel="http://schemas.microsoft.com/office/2019/extlst">
             <w:pict>
               <v:group id="Group 55208" style="width:475.25pt;height:0.5pt;mso-position-horizontal-relative:char;mso-position-vertical-relative:line" coordsize="60356,63">
                 <v:shape id="Shape 6974" style="position:absolute;width:60356;height:0;left:0;top:0;" coordsize="6035675,0" path="m6035675,0l0,0">
@@ -14447,7 +14454,7 @@
               </wp:inline>
             </w:drawing>
           </mc:Choice>
-          <mc:Fallback xmlns:oel="http://schemas.microsoft.com/office/2019/extlst" xmlns:w16du="http://schemas.microsoft.com/office/word/2023/wordml/word16du" xmlns:w16sdtfl="http://schemas.microsoft.com/office/word/2024/wordml/sdtformatlock" xmlns:a="http://schemas.openxmlformats.org/drawingml/2006/main">
+          <mc:Fallback xmlns:a="http://schemas.openxmlformats.org/drawingml/2006/main" xmlns:w16sdtfl="http://schemas.microsoft.com/office/word/2024/wordml/sdtformatlock" xmlns:w16du="http://schemas.microsoft.com/office/word/2023/wordml/word16du" xmlns:oel="http://schemas.microsoft.com/office/2019/extlst">
             <w:pict>
               <v:group id="Group 57479" style="width:475.25pt;height:0.5pt;mso-position-horizontal-relative:char;mso-position-vertical-relative:line" coordsize="60356,63">
                 <v:shape id="Shape 7257" style="position:absolute;width:60356;height:0;left:0;top:0;" coordsize="6035675,0" path="m6035675,0l0,0">
@@ -15378,7 +15385,7 @@
               </wp:inline>
             </w:drawing>
           </mc:Choice>
-          <mc:Fallback xmlns:oel="http://schemas.microsoft.com/office/2019/extlst" xmlns:w16du="http://schemas.microsoft.com/office/word/2023/wordml/word16du" xmlns:w16sdtfl="http://schemas.microsoft.com/office/word/2024/wordml/sdtformatlock" xmlns:a="http://schemas.openxmlformats.org/drawingml/2006/main">
+          <mc:Fallback xmlns:a="http://schemas.openxmlformats.org/drawingml/2006/main" xmlns:w16sdtfl="http://schemas.microsoft.com/office/word/2024/wordml/sdtformatlock" xmlns:w16du="http://schemas.microsoft.com/office/word/2023/wordml/word16du" xmlns:oel="http://schemas.microsoft.com/office/2019/extlst">
             <w:pict>
               <v:group id="Group 44322" style="width:475.25pt;height:0.5pt;mso-position-horizontal-relative:char;mso-position-vertical-relative:line" coordsize="60356,63">
                 <v:shape id="Shape 7451" style="position:absolute;width:60356;height:0;left:0;top:0;" coordsize="6035675,0" path="m6035675,0l0,0">
@@ -17178,7 +17185,7 @@
               </wp:inline>
             </w:drawing>
           </mc:Choice>
-          <mc:Fallback xmlns:oel="http://schemas.microsoft.com/office/2019/extlst" xmlns:w16du="http://schemas.microsoft.com/office/word/2023/wordml/word16du" xmlns:w16sdtfl="http://schemas.microsoft.com/office/word/2024/wordml/sdtformatlock" xmlns:a="http://schemas.openxmlformats.org/drawingml/2006/main">
+          <mc:Fallback xmlns:a="http://schemas.openxmlformats.org/drawingml/2006/main" xmlns:w16sdtfl="http://schemas.microsoft.com/office/word/2024/wordml/sdtformatlock" xmlns:w16du="http://schemas.microsoft.com/office/word/2023/wordml/word16du" xmlns:oel="http://schemas.microsoft.com/office/2019/extlst">
             <w:pict>
               <v:group id="Group 56815" style="width:475.25pt;height:0.5pt;mso-position-horizontal-relative:char;mso-position-vertical-relative:line" coordsize="60356,63">
                 <v:shape id="Shape 8000" style="position:absolute;width:60356;height:0;left:0;top:0;" coordsize="6035675,0" path="m6035675,0l0,0">
@@ -17551,7 +17558,7 @@
               </wp:inline>
             </w:drawing>
           </mc:Choice>
-          <mc:Fallback xmlns:oel="http://schemas.microsoft.com/office/2019/extlst" xmlns:w16du="http://schemas.microsoft.com/office/word/2023/wordml/word16du" xmlns:w16sdtfl="http://schemas.microsoft.com/office/word/2024/wordml/sdtformatlock">
+          <mc:Fallback xmlns:w16sdtfl="http://schemas.microsoft.com/office/word/2024/wordml/sdtformatlock" xmlns:w16du="http://schemas.microsoft.com/office/word/2023/wordml/word16du" xmlns:oel="http://schemas.microsoft.com/office/2019/extlst">
             <w:pict>
               <v:group w14:anchorId="45D2F1E8" id="Group 82862" o:spid="_x0000_s1026" style="width:475.25pt;height:.5pt;mso-position-horizontal-relative:char;mso-position-vertical-relative:line" coordsize="60356,63" o:gfxdata="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">
                 <v:shape id="Shape 11542" o:spid="_x0000_s1027" style="position:absolute;width:60356;height:0;visibility:visible;mso-wrap-style:square;v-text-anchor:top" coordsize="6035675,0" o:gfxdata="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" path="m6035675,l,e" filled="f" strokecolor="#d5e8f0" strokeweight=".5pt">
@@ -18191,7 +18198,7 @@
               </wp:inline>
             </w:drawing>
           </mc:Choice>
-          <mc:Fallback xmlns:oel="http://schemas.microsoft.com/office/2019/extlst" xmlns:w16du="http://schemas.microsoft.com/office/word/2023/wordml/word16du" xmlns:w16sdtfl="http://schemas.microsoft.com/office/word/2024/wordml/sdtformatlock">
+          <mc:Fallback xmlns:w16sdtfl="http://schemas.microsoft.com/office/word/2024/wordml/sdtformatlock" xmlns:w16du="http://schemas.microsoft.com/office/word/2023/wordml/word16du" xmlns:oel="http://schemas.microsoft.com/office/2019/extlst">
             <w:pict>
               <v:group w14:anchorId="7A8037F3" id="Group 82863" o:spid="_x0000_s1026" style="width:475.25pt;height:.5pt;mso-position-horizontal-relative:char;mso-position-vertical-relative:line" coordsize="60356,63" o:gfxdata="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">
                 <v:shape id="Shape 11543" o:spid="_x0000_s1027" style="position:absolute;width:60356;height:0;visibility:visible;mso-wrap-style:square;v-text-anchor:top" coordsize="6035675,0" o:gfxdata="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" path="m6035675,l,e" filled="f" strokecolor="#d5e8f0" strokeweight=".5pt">
@@ -22323,7 +22330,7 @@
               </wp:inline>
             </w:drawing>
           </mc:Choice>
-          <mc:Fallback xmlns:oel="http://schemas.microsoft.com/office/2019/extlst" xmlns:w16du="http://schemas.microsoft.com/office/word/2023/wordml/word16du" xmlns:w16sdtfl="http://schemas.microsoft.com/office/word/2024/wordml/sdtformatlock">
+          <mc:Fallback xmlns:w16sdtfl="http://schemas.microsoft.com/office/word/2024/wordml/sdtformatlock" xmlns:w16du="http://schemas.microsoft.com/office/word/2023/wordml/word16du" xmlns:oel="http://schemas.microsoft.com/office/2019/extlst">
             <w:pict>
               <v:group w14:anchorId="58510B1F" id="Group 85545" o:spid="_x0000_s1026" style="width:475.25pt;height:.5pt;mso-position-horizontal-relative:char;mso-position-vertical-relative:line" coordsize="60356,63" o:gfxdata="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">
                 <v:shape id="Shape 12844" o:spid="_x0000_s1027" style="position:absolute;width:60356;height:0;visibility:visible;mso-wrap-style:square;v-text-anchor:top" coordsize="6035675,0" o:gfxdata="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" path="m6035675,l,e" filled="f" strokecolor="#d5e8f0" strokeweight=".5pt">
@@ -22983,7 +22990,7 @@
               </wp:inline>
             </w:drawing>
           </mc:Choice>
-          <mc:Fallback xmlns:oel="http://schemas.microsoft.com/office/2019/extlst" xmlns:w16du="http://schemas.microsoft.com/office/word/2023/wordml/word16du" xmlns:w16sdtfl="http://schemas.microsoft.com/office/word/2024/wordml/sdtformatlock">
+          <mc:Fallback xmlns:w16sdtfl="http://schemas.microsoft.com/office/word/2024/wordml/sdtformatlock" xmlns:w16du="http://schemas.microsoft.com/office/word/2023/wordml/word16du" xmlns:oel="http://schemas.microsoft.com/office/2019/extlst">
             <w:pict>
               <v:group w14:anchorId="3CFDBB96" id="Group 85546" o:spid="_x0000_s1026" style="width:475.25pt;height:.5pt;mso-position-horizontal-relative:char;mso-position-vertical-relative:line" coordsize="60356,63" o:gfxdata="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">
                 <v:shape id="Shape 12845" o:spid="_x0000_s1027" style="position:absolute;width:60356;height:0;visibility:visible;mso-wrap-style:square;v-text-anchor:top" coordsize="6035675,0" o:gfxdata="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" path="m6035675,l,e" filled="f" strokecolor="#d5e8f0" strokeweight=".5pt">
@@ -24740,7 +24747,7 @@
               </wp:inline>
             </w:drawing>
           </mc:Choice>
-          <mc:Fallback xmlns:oel="http://schemas.microsoft.com/office/2019/extlst" xmlns:w16du="http://schemas.microsoft.com/office/word/2023/wordml/word16du" xmlns:w16sdtfl="http://schemas.microsoft.com/office/word/2024/wordml/sdtformatlock">
+          <mc:Fallback xmlns:w16sdtfl="http://schemas.microsoft.com/office/word/2024/wordml/sdtformatlock" xmlns:w16du="http://schemas.microsoft.com/office/word/2023/wordml/word16du" xmlns:oel="http://schemas.microsoft.com/office/2019/extlst">
             <w:pict>
               <v:group w14:anchorId="31CA7639" id="Group 86405" o:spid="_x0000_s1026" style="width:475.25pt;height:.5pt;mso-position-horizontal-relative:char;mso-position-vertical-relative:line" coordsize="60356,63" o:gfxdata="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">
                 <v:shape id="Shape 13213" o:spid="_x0000_s1027" style="position:absolute;width:60356;height:0;visibility:visible;mso-wrap-style:square;v-text-anchor:top" coordsize="6035675,0" o:gfxdata="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" path="m6035675,l,e" filled="f" strokecolor="#d5e8f0" strokeweight=".5pt">
@@ -25129,7 +25136,7 @@
               </wp:inline>
             </w:drawing>
           </mc:Choice>
-          <mc:Fallback xmlns:oel="http://schemas.microsoft.com/office/2019/extlst" xmlns:w16du="http://schemas.microsoft.com/office/word/2023/wordml/word16du" xmlns:w16sdtfl="http://schemas.microsoft.com/office/word/2024/wordml/sdtformatlock" xmlns:a="http://schemas.openxmlformats.org/drawingml/2006/main">
+          <mc:Fallback xmlns:a="http://schemas.openxmlformats.org/drawingml/2006/main" xmlns:w16sdtfl="http://schemas.microsoft.com/office/word/2024/wordml/sdtformatlock" xmlns:w16du="http://schemas.microsoft.com/office/word/2023/wordml/word16du" xmlns:oel="http://schemas.microsoft.com/office/2019/extlst">
             <w:pict>
               <v:group id="Group 57907" style="width:475.25pt;height:0.5pt;mso-position-horizontal-relative:char;mso-position-vertical-relative:line" coordsize="60356,63">
                 <v:shape id="Shape 8147" style="position:absolute;width:60356;height:0;left:0;top:0;" coordsize="6035675,0" path="m6035675,0l0,0">
@@ -25629,7 +25636,7 @@
               </wp:inline>
             </w:drawing>
           </mc:Choice>
-          <mc:Fallback xmlns:oel="http://schemas.microsoft.com/office/2019/extlst" xmlns:w16du="http://schemas.microsoft.com/office/word/2023/wordml/word16du" xmlns:w16sdtfl="http://schemas.microsoft.com/office/word/2024/wordml/sdtformatlock" xmlns:a="http://schemas.openxmlformats.org/drawingml/2006/main">
+          <mc:Fallback xmlns:a="http://schemas.openxmlformats.org/drawingml/2006/main" xmlns:w16sdtfl="http://schemas.microsoft.com/office/word/2024/wordml/sdtformatlock" xmlns:w16du="http://schemas.microsoft.com/office/word/2023/wordml/word16du" xmlns:oel="http://schemas.microsoft.com/office/2019/extlst">
             <w:pict>
               <v:group id="Group 57908" style="width:475.25pt;height:0.5pt;mso-position-horizontal-relative:char;mso-position-vertical-relative:line" coordsize="60356,63">
                 <v:shape id="Shape 8148" style="position:absolute;width:60356;height:0;left:0;top:0;" coordsize="6035675,0" path="m6035675,0l0,0">
@@ -26103,7 +26110,7 @@
               </wp:inline>
             </w:drawing>
           </mc:Choice>
-          <mc:Fallback xmlns:oel="http://schemas.microsoft.com/office/2019/extlst" xmlns:w16du="http://schemas.microsoft.com/office/word/2023/wordml/word16du" xmlns:w16sdtfl="http://schemas.microsoft.com/office/word/2024/wordml/sdtformatlock" xmlns:a="http://schemas.openxmlformats.org/drawingml/2006/main">
+          <mc:Fallback xmlns:a="http://schemas.openxmlformats.org/drawingml/2006/main" xmlns:w16sdtfl="http://schemas.microsoft.com/office/word/2024/wordml/sdtformatlock" xmlns:w16du="http://schemas.microsoft.com/office/word/2023/wordml/word16du" xmlns:oel="http://schemas.microsoft.com/office/2019/extlst">
             <w:pict>
               <v:group id="Group 59320" style="width:475.25pt;height:0.5pt;mso-position-horizontal-relative:char;mso-position-vertical-relative:line" coordsize="60356,63">
                 <v:shape id="Shape 8316" style="position:absolute;width:60356;height:0;left:0;top:0;" coordsize="6035675,0" path="m6035675,0l0,0">
@@ -30635,7 +30642,7 @@
             </wp:anchor>
           </w:drawing>
         </mc:Choice>
-        <mc:Fallback xmlns:oel="http://schemas.microsoft.com/office/2019/extlst" xmlns:w16du="http://schemas.microsoft.com/office/word/2023/wordml/word16du" xmlns:w16sdtfl="http://schemas.microsoft.com/office/word/2024/wordml/sdtformatlock" xmlns:a="http://schemas.openxmlformats.org/drawingml/2006/main">
+        <mc:Fallback xmlns:a="http://schemas.openxmlformats.org/drawingml/2006/main" xmlns:w16sdtfl="http://schemas.microsoft.com/office/word/2024/wordml/sdtformatlock" xmlns:w16du="http://schemas.microsoft.com/office/word/2023/wordml/word16du" xmlns:oel="http://schemas.microsoft.com/office/2019/extlst">
           <w:pict>
             <v:group id="Group 61490" style="width:475.25pt;height:0.75pt;position:absolute;mso-position-horizontal-relative:page;mso-position-horizontal:absolute;margin-left:60pt;mso-position-vertical-relative:page;margin-top:795.801pt;" coordsize="60356,95">
               <v:shape id="Shape 61491" style="position:absolute;width:60356;height:0;left:0;top:0;" coordsize="6035675,0" path="m0,0l6035675,0">
@@ -30810,7 +30817,7 @@
             </wp:anchor>
           </w:drawing>
         </mc:Choice>
-        <mc:Fallback xmlns:oel="http://schemas.microsoft.com/office/2019/extlst" xmlns:w16du="http://schemas.microsoft.com/office/word/2023/wordml/word16du" xmlns:w16sdtfl="http://schemas.microsoft.com/office/word/2024/wordml/sdtformatlock" xmlns:a="http://schemas.openxmlformats.org/drawingml/2006/main">
+        <mc:Fallback xmlns:a="http://schemas.openxmlformats.org/drawingml/2006/main" xmlns:w16sdtfl="http://schemas.microsoft.com/office/word/2024/wordml/sdtformatlock" xmlns:w16du="http://schemas.microsoft.com/office/word/2023/wordml/word16du" xmlns:oel="http://schemas.microsoft.com/office/2019/extlst">
           <w:pict>
             <v:group id="Group 61471" style="width:475.25pt;height:0.75pt;position:absolute;mso-position-horizontal-relative:page;mso-position-horizontal:absolute;margin-left:60pt;mso-position-vertical-relative:page;margin-top:795.801pt;" coordsize="60356,95">
               <v:shape id="Shape 61472" style="position:absolute;width:60356;height:0;left:0;top:0;" coordsize="6035675,0" path="m0,0l6035675,0">
@@ -30978,7 +30985,7 @@
             </wp:anchor>
           </w:drawing>
         </mc:Choice>
-        <mc:Fallback xmlns:oel="http://schemas.microsoft.com/office/2019/extlst" xmlns:w16du="http://schemas.microsoft.com/office/word/2023/wordml/word16du" xmlns:w16sdtfl="http://schemas.microsoft.com/office/word/2024/wordml/sdtformatlock" xmlns:a="http://schemas.openxmlformats.org/drawingml/2006/main">
+        <mc:Fallback xmlns:a="http://schemas.openxmlformats.org/drawingml/2006/main" xmlns:w16sdtfl="http://schemas.microsoft.com/office/word/2024/wordml/sdtformatlock" xmlns:w16du="http://schemas.microsoft.com/office/word/2023/wordml/word16du" xmlns:oel="http://schemas.microsoft.com/office/2019/extlst">
           <w:pict>
             <v:group id="Group 61452" style="width:475.25pt;height:0.75pt;position:absolute;mso-position-horizontal-relative:page;mso-position-horizontal:absolute;margin-left:60pt;mso-position-vertical-relative:page;margin-top:795.801pt;" coordsize="60356,95">
               <v:shape id="Shape 61453" style="position:absolute;width:60356;height:0;left:0;top:0;" coordsize="6035675,0" path="m0,0l6035675,0">

</xml_diff>

<commit_message>
<feat><commun> : Modif du fichier docx
</commit_message>
<xml_diff>
--- a/TP2_Flask_Kanban_GitHub.docx
+++ b/TP2_Flask_Kanban_GitHub.docx
@@ -304,7 +304,7 @@
               </wp:inline>
             </w:drawing>
           </mc:Choice>
-          <mc:Fallback xmlns:a="http://schemas.openxmlformats.org/drawingml/2006/main" xmlns:w16sdtfl="http://schemas.microsoft.com/office/word/2024/wordml/sdtformatlock" xmlns:w16du="http://schemas.microsoft.com/office/word/2023/wordml/word16du" xmlns:oel="http://schemas.microsoft.com/office/2019/extlst">
+          <mc:Fallback xmlns:oel="http://schemas.microsoft.com/office/2019/extlst" xmlns:w16du="http://schemas.microsoft.com/office/word/2023/wordml/word16du" xmlns:w16sdtfl="http://schemas.microsoft.com/office/word/2024/wordml/sdtformatlock" xmlns:a="http://schemas.openxmlformats.org/drawingml/2006/main">
             <w:pict>
               <v:group id="Group 50839" style="width:475.25pt;height:0.5pt;mso-position-horizontal-relative:char;mso-position-vertical-relative:line" coordsize="60356,63">
                 <v:shape id="Shape 4814" style="position:absolute;width:60356;height:0;left:0;top:0;" coordsize="6035675,0" path="m6035675,0l0,0">
@@ -581,7 +581,7 @@
               </wp:inline>
             </w:drawing>
           </mc:Choice>
-          <mc:Fallback xmlns:a="http://schemas.openxmlformats.org/drawingml/2006/main" xmlns:w16sdtfl="http://schemas.microsoft.com/office/word/2024/wordml/sdtformatlock" xmlns:w16du="http://schemas.microsoft.com/office/word/2023/wordml/word16du" xmlns:oel="http://schemas.microsoft.com/office/2019/extlst">
+          <mc:Fallback xmlns:oel="http://schemas.microsoft.com/office/2019/extlst" xmlns:w16du="http://schemas.microsoft.com/office/word/2023/wordml/word16du" xmlns:w16sdtfl="http://schemas.microsoft.com/office/word/2024/wordml/sdtformatlock" xmlns:a="http://schemas.openxmlformats.org/drawingml/2006/main">
             <w:pict>
               <v:group id="Group 50840" style="width:475.25pt;height:0.5pt;mso-position-horizontal-relative:char;mso-position-vertical-relative:line" coordsize="60356,63">
                 <v:shape id="Shape 4815" style="position:absolute;width:60356;height:0;left:0;top:0;" coordsize="6035675,0" path="m6035675,0l0,0">
@@ -1874,7 +1874,7 @@
               </wp:inline>
             </w:drawing>
           </mc:Choice>
-          <mc:Fallback xmlns:a="http://schemas.openxmlformats.org/drawingml/2006/main" xmlns:w16sdtfl="http://schemas.microsoft.com/office/word/2024/wordml/sdtformatlock" xmlns:w16du="http://schemas.microsoft.com/office/word/2023/wordml/word16du" xmlns:oel="http://schemas.microsoft.com/office/2019/extlst">
+          <mc:Fallback xmlns:oel="http://schemas.microsoft.com/office/2019/extlst" xmlns:w16du="http://schemas.microsoft.com/office/word/2023/wordml/word16du" xmlns:w16sdtfl="http://schemas.microsoft.com/office/word/2024/wordml/sdtformatlock" xmlns:a="http://schemas.openxmlformats.org/drawingml/2006/main">
             <w:pict>
               <v:group id="Group 45330" style="width:475.25pt;height:0.5pt;mso-position-horizontal-relative:char;mso-position-vertical-relative:line" coordsize="60356,63">
                 <v:shape id="Shape 4951" style="position:absolute;width:60356;height:0;left:0;top:0;" coordsize="6035675,0" path="m6035675,0l0,0">
@@ -2510,7 +2510,7 @@
               </wp:inline>
             </w:drawing>
           </mc:Choice>
-          <mc:Fallback xmlns:a="http://schemas.openxmlformats.org/drawingml/2006/main" xmlns:w16sdtfl="http://schemas.microsoft.com/office/word/2024/wordml/sdtformatlock" xmlns:w16du="http://schemas.microsoft.com/office/word/2023/wordml/word16du" xmlns:oel="http://schemas.microsoft.com/office/2019/extlst">
+          <mc:Fallback xmlns:oel="http://schemas.microsoft.com/office/2019/extlst" xmlns:w16du="http://schemas.microsoft.com/office/word/2023/wordml/word16du" xmlns:w16sdtfl="http://schemas.microsoft.com/office/word/2024/wordml/sdtformatlock" xmlns:a="http://schemas.openxmlformats.org/drawingml/2006/main">
             <w:pict>
               <v:group id="Group 45331" style="width:475.25pt;height:0.5pt;mso-position-horizontal-relative:char;mso-position-vertical-relative:line" coordsize="60356,63">
                 <v:shape id="Shape 4952" style="position:absolute;width:60356;height:0;left:0;top:0;" coordsize="6035675,0" path="m6035675,0l0,0">
@@ -2679,7 +2679,19 @@
         <w:rPr>
           <w:lang w:val="fr-FR"/>
         </w:rPr>
-        <w:t>es collaborateur :</w:t>
+        <w:t>es collaborateur</w:t>
+      </w:r>
+      <w:r>
+        <w:rPr>
+          <w:lang w:val="fr-FR"/>
+        </w:rPr>
+        <w:t>s</w:t>
+      </w:r>
+      <w:r>
+        <w:rPr>
+          <w:lang w:val="fr-FR"/>
+        </w:rPr>
+        <w:t> :</w:t>
       </w:r>
     </w:p>
     <w:p>
@@ -2868,7 +2880,7 @@
               </wp:inline>
             </w:drawing>
           </mc:Choice>
-          <mc:Fallback xmlns:a="http://schemas.openxmlformats.org/drawingml/2006/main" xmlns:w16sdtfl="http://schemas.microsoft.com/office/word/2024/wordml/sdtformatlock" xmlns:w16du="http://schemas.microsoft.com/office/word/2023/wordml/word16du" xmlns:oel="http://schemas.microsoft.com/office/2019/extlst">
+          <mc:Fallback xmlns:oel="http://schemas.microsoft.com/office/2019/extlst" xmlns:w16du="http://schemas.microsoft.com/office/word/2023/wordml/word16du" xmlns:w16sdtfl="http://schemas.microsoft.com/office/word/2024/wordml/sdtformatlock" xmlns:a="http://schemas.openxmlformats.org/drawingml/2006/main">
             <w:pict>
               <v:group id="Group 55004" style="width:475.25pt;height:0.5pt;mso-position-horizontal-relative:char;mso-position-vertical-relative:line" coordsize="60356,63">
                 <v:shape id="Shape 5192" style="position:absolute;width:60356;height:0;left:0;top:0;" coordsize="6035675,0" path="m6035675,0l0,0">
@@ -3688,6 +3700,53 @@
         <w:pStyle w:val="Titre4"/>
         <w:ind w:left="-5"/>
       </w:pPr>
+    </w:p>
+    <w:p>
+      <w:pPr>
+        <w:rPr>
+          <w:lang w:val="fr-FR" w:eastAsia="fr-FR" w:bidi="ar-SA"/>
+        </w:rPr>
+      </w:pPr>
+      <w:r>
+        <w:rPr>
+          <w:lang w:val="fr-FR" w:eastAsia="fr-FR" w:bidi="ar-SA"/>
+        </w:rPr>
+        <w:drawing>
+          <wp:inline distT="0" distB="0" distL="0" distR="0" wp14:anchorId="501C6591" wp14:editId="101CF0FD">
+            <wp:extent cx="6043295" cy="2903220"/>
+            <wp:effectExtent l="0" t="0" r="0" b="0"/>
+            <wp:docPr id="3" name="Image 3"/>
+            <wp:cNvGraphicFramePr>
+              <a:graphicFrameLocks xmlns:a="http://schemas.openxmlformats.org/drawingml/2006/main" noChangeAspect="1"/>
+            </wp:cNvGraphicFramePr>
+            <a:graphic xmlns:a="http://schemas.openxmlformats.org/drawingml/2006/main">
+              <a:graphicData uri="http://schemas.openxmlformats.org/drawingml/2006/picture">
+                <pic:pic xmlns:pic="http://schemas.openxmlformats.org/drawingml/2006/picture">
+                  <pic:nvPicPr>
+                    <pic:cNvPr id="1" name=""/>
+                    <pic:cNvPicPr/>
+                  </pic:nvPicPr>
+                  <pic:blipFill>
+                    <a:blip r:embed="rId9"/>
+                    <a:stretch>
+                      <a:fillRect/>
+                    </a:stretch>
+                  </pic:blipFill>
+                  <pic:spPr>
+                    <a:xfrm>
+                      <a:off x="0" y="0"/>
+                      <a:ext cx="6043295" cy="2903220"/>
+                    </a:xfrm>
+                    <a:prstGeom prst="rect">
+                      <a:avLst/>
+                    </a:prstGeom>
+                  </pic:spPr>
+                </pic:pic>
+              </a:graphicData>
+            </a:graphic>
+          </wp:inline>
+        </w:drawing>
+      </w:r>
     </w:p>
     <w:p>
       <w:pPr>
@@ -3865,7 +3924,7 @@
               </wp:inline>
             </w:drawing>
           </mc:Choice>
-          <mc:Fallback xmlns:a="http://schemas.openxmlformats.org/drawingml/2006/main" xmlns:w16sdtfl="http://schemas.microsoft.com/office/word/2024/wordml/sdtformatlock" xmlns:w16du="http://schemas.microsoft.com/office/word/2023/wordml/word16du" xmlns:oel="http://schemas.microsoft.com/office/2019/extlst">
+          <mc:Fallback xmlns:oel="http://schemas.microsoft.com/office/2019/extlst" xmlns:w16du="http://schemas.microsoft.com/office/word/2023/wordml/word16du" xmlns:w16sdtfl="http://schemas.microsoft.com/office/word/2024/wordml/sdtformatlock" xmlns:a="http://schemas.openxmlformats.org/drawingml/2006/main">
             <w:pict>
               <v:group id="Group 55005" style="width:475.25pt;height:0.5pt;mso-position-horizontal-relative:char;mso-position-vertical-relative:line" coordsize="60356,63">
                 <v:shape id="Shape 5193" style="position:absolute;width:60356;height:0;left:0;top:0;" coordsize="6035675,0" path="m6035675,0l0,0">
@@ -4035,6 +4094,7 @@
         <w:rPr>
           <w:lang w:val="fr-FR"/>
         </w:rPr>
+        <w:lastRenderedPageBreak/>
         <w:t>Avant de coder, créez TOUTES les tâches sous forme d'issues GitHub et ajoutez-les au Project. Voici la liste des issues à créer. Chacune doit préciser : titre, description, label, assigné et milestone.</w:t>
       </w:r>
     </w:p>
@@ -4884,7 +4944,6 @@
               <w:rPr>
                 <w:sz w:val="20"/>
               </w:rPr>
-              <w:lastRenderedPageBreak/>
               <w:t>#4</w:t>
             </w:r>
           </w:p>
@@ -5956,7 +6015,17 @@
             </w:tcBorders>
           </w:tcPr>
           <w:p>
-            <w:r>
+            <w:pPr>
+              <w:rPr>
+                <w:sz w:val="20"/>
+                <w:szCs w:val="22"/>
+              </w:rPr>
+            </w:pPr>
+            <w:r>
+              <w:rPr>
+                <w:sz w:val="20"/>
+                <w:szCs w:val="22"/>
+              </w:rPr>
               <w:t>Minh-Tam</w:t>
             </w:r>
           </w:p>
@@ -6913,6 +6982,46 @@
           <w:lang w:val="fr-FR" w:eastAsia="fr-FR" w:bidi="ar-SA"/>
         </w:rPr>
       </w:pPr>
+      <w:r>
+        <w:rPr>
+          <w:lang w:val="fr-FR" w:eastAsia="fr-FR" w:bidi="ar-SA"/>
+        </w:rPr>
+        <w:drawing>
+          <wp:inline distT="0" distB="0" distL="0" distR="0" wp14:anchorId="733A7853" wp14:editId="17F94EF0">
+            <wp:extent cx="6043295" cy="2515235"/>
+            <wp:effectExtent l="0" t="0" r="0" b="0"/>
+            <wp:docPr id="4" name="Image 4"/>
+            <wp:cNvGraphicFramePr>
+              <a:graphicFrameLocks xmlns:a="http://schemas.openxmlformats.org/drawingml/2006/main" noChangeAspect="1"/>
+            </wp:cNvGraphicFramePr>
+            <a:graphic xmlns:a="http://schemas.openxmlformats.org/drawingml/2006/main">
+              <a:graphicData uri="http://schemas.openxmlformats.org/drawingml/2006/picture">
+                <pic:pic xmlns:pic="http://schemas.openxmlformats.org/drawingml/2006/picture">
+                  <pic:nvPicPr>
+                    <pic:cNvPr id="1" name=""/>
+                    <pic:cNvPicPr/>
+                  </pic:nvPicPr>
+                  <pic:blipFill>
+                    <a:blip r:embed="rId10"/>
+                    <a:stretch>
+                      <a:fillRect/>
+                    </a:stretch>
+                  </pic:blipFill>
+                  <pic:spPr>
+                    <a:xfrm>
+                      <a:off x="0" y="0"/>
+                      <a:ext cx="6043295" cy="2515235"/>
+                    </a:xfrm>
+                    <a:prstGeom prst="rect">
+                      <a:avLst/>
+                    </a:prstGeom>
+                  </pic:spPr>
+                </pic:pic>
+              </a:graphicData>
+            </a:graphic>
+          </wp:inline>
+        </w:drawing>
+      </w:r>
     </w:p>
     <w:p>
       <w:pPr>
@@ -7057,7 +7166,7 @@
               </wp:inline>
             </w:drawing>
           </mc:Choice>
-          <mc:Fallback xmlns:a="http://schemas.openxmlformats.org/drawingml/2006/main" xmlns:w16sdtfl="http://schemas.microsoft.com/office/word/2024/wordml/sdtformatlock" xmlns:w16du="http://schemas.microsoft.com/office/word/2023/wordml/word16du" xmlns:oel="http://schemas.microsoft.com/office/2019/extlst">
+          <mc:Fallback xmlns:oel="http://schemas.microsoft.com/office/2019/extlst" xmlns:w16du="http://schemas.microsoft.com/office/word/2023/wordml/word16du" xmlns:w16sdtfl="http://schemas.microsoft.com/office/word/2024/wordml/sdtformatlock" xmlns:a="http://schemas.openxmlformats.org/drawingml/2006/main">
             <w:pict>
               <v:group id="Group 59284" style="width:475.25pt;height:0.5pt;mso-position-horizontal-relative:char;mso-position-vertical-relative:line" coordsize="60356,63">
                 <v:shape id="Shape 5645" style="position:absolute;width:60356;height:0;left:0;top:0;" coordsize="6035675,0" path="m6035675,0l0,0">
@@ -7166,7 +7275,6 @@
               <w:rPr>
                 <w:sz w:val="20"/>
               </w:rPr>
-              <w:lastRenderedPageBreak/>
               <w:t>main</w:t>
             </w:r>
           </w:p>
@@ -7562,6 +7670,50 @@
         </w:tc>
       </w:tr>
     </w:tbl>
+    <w:p>
+      <w:pPr>
+        <w:pStyle w:val="Titre4"/>
+        <w:ind w:left="-5"/>
+      </w:pPr>
+      <w:r>
+        <w:lastRenderedPageBreak/>
+        <w:drawing>
+          <wp:inline distT="0" distB="0" distL="0" distR="0" wp14:anchorId="23C52862" wp14:editId="5DAAFBA3">
+            <wp:extent cx="5430008" cy="1790950"/>
+            <wp:effectExtent l="0" t="0" r="0" b="0"/>
+            <wp:docPr id="5" name="Image 5"/>
+            <wp:cNvGraphicFramePr>
+              <a:graphicFrameLocks xmlns:a="http://schemas.openxmlformats.org/drawingml/2006/main" noChangeAspect="1"/>
+            </wp:cNvGraphicFramePr>
+            <a:graphic xmlns:a="http://schemas.openxmlformats.org/drawingml/2006/main">
+              <a:graphicData uri="http://schemas.openxmlformats.org/drawingml/2006/picture">
+                <pic:pic xmlns:pic="http://schemas.openxmlformats.org/drawingml/2006/picture">
+                  <pic:nvPicPr>
+                    <pic:cNvPr id="1" name=""/>
+                    <pic:cNvPicPr/>
+                  </pic:nvPicPr>
+                  <pic:blipFill>
+                    <a:blip r:embed="rId11"/>
+                    <a:stretch>
+                      <a:fillRect/>
+                    </a:stretch>
+                  </pic:blipFill>
+                  <pic:spPr>
+                    <a:xfrm>
+                      <a:off x="0" y="0"/>
+                      <a:ext cx="5430008" cy="1790950"/>
+                    </a:xfrm>
+                    <a:prstGeom prst="rect">
+                      <a:avLst/>
+                    </a:prstGeom>
+                  </pic:spPr>
+                </pic:pic>
+              </a:graphicData>
+            </a:graphic>
+          </wp:inline>
+        </w:drawing>
+      </w:r>
+    </w:p>
     <w:p>
       <w:pPr>
         <w:pStyle w:val="Titre4"/>
@@ -7696,7 +7848,7 @@
               </wp:inline>
             </w:drawing>
           </mc:Choice>
-          <mc:Fallback xmlns:a="http://schemas.openxmlformats.org/drawingml/2006/main" xmlns:w16sdtfl="http://schemas.microsoft.com/office/word/2024/wordml/sdtformatlock" xmlns:w16du="http://schemas.microsoft.com/office/word/2023/wordml/word16du" xmlns:oel="http://schemas.microsoft.com/office/2019/extlst">
+          <mc:Fallback xmlns:oel="http://schemas.microsoft.com/office/2019/extlst" xmlns:w16du="http://schemas.microsoft.com/office/word/2023/wordml/word16du" xmlns:w16sdtfl="http://schemas.microsoft.com/office/word/2024/wordml/sdtformatlock" xmlns:a="http://schemas.openxmlformats.org/drawingml/2006/main">
             <w:pict>
               <v:group id="Group 45030" style="width:475.25pt;height:0.5pt;mso-position-horizontal-relative:char;mso-position-vertical-relative:line" coordsize="60356,63">
                 <v:shape id="Shape 5755" style="position:absolute;width:60356;height:0;left:0;top:0;" coordsize="6035675,0" path="m6035675,0l0,0">
@@ -7901,7 +8053,7 @@
               </wp:inline>
             </w:drawing>
           </mc:Choice>
-          <mc:Fallback xmlns:a="http://schemas.openxmlformats.org/drawingml/2006/main" xmlns:w16sdtfl="http://schemas.microsoft.com/office/word/2024/wordml/sdtformatlock" xmlns:w16du="http://schemas.microsoft.com/office/word/2023/wordml/word16du" xmlns:oel="http://schemas.microsoft.com/office/2019/extlst">
+          <mc:Fallback xmlns:oel="http://schemas.microsoft.com/office/2019/extlst" xmlns:w16du="http://schemas.microsoft.com/office/word/2023/wordml/word16du" xmlns:w16sdtfl="http://schemas.microsoft.com/office/word/2024/wordml/sdtformatlock" xmlns:a="http://schemas.openxmlformats.org/drawingml/2006/main">
             <w:pict>
               <v:group id="Group 45031" style="width:475.25pt;height:0.5pt;mso-position-horizontal-relative:char;mso-position-vertical-relative:line" coordsize="60356,63">
                 <v:shape id="Shape 5756" style="position:absolute;width:60356;height:0;left:0;top:0;" coordsize="6035675,0" path="m6035675,0l0,0">
@@ -7969,9 +8121,31 @@
       </w:pPr>
       <w:r>
         <w:rPr>
-          <w:lang w:val="fr-FR"/>
-        </w:rPr>
-        <w:t>Q2. Combien de colonnes votre tableau Kanban possède-t-il ? Quelle est la règle WIP ?</w:t>
+          <w:color w:val="FF0000"/>
+          <w:lang w:val="fr-FR"/>
+        </w:rPr>
+        <w:t>Adam est le Chef de projet. Adrien s</w:t>
+      </w:r>
+      <w:r>
+        <w:rPr>
+          <w:color w:val="FF0000"/>
+          <w:lang w:val="fr-FR"/>
+        </w:rPr>
+        <w:t>’occupe du service1 / Adam s’occupe du service2 / Minh-Tam s’occupe du service3</w:t>
+      </w:r>
+      <w:r>
+        <w:rPr>
+          <w:color w:val="FF0000"/>
+          <w:lang w:val="fr-FR"/>
+        </w:rPr>
+        <w:t xml:space="preserve"> et Lokman</w:t>
+      </w:r>
+      <w:r>
+        <w:rPr>
+          <w:color w:val="FF0000"/>
+          <w:lang w:val="fr-FR"/>
+        </w:rPr>
+        <w:t xml:space="preserve"> s’occupe du service4.</w:t>
       </w:r>
     </w:p>
     <w:p>
@@ -7991,7 +8165,67 @@
         <w:rPr>
           <w:lang w:val="fr-FR"/>
         </w:rPr>
-        <w:t>Q3. Quelle est la différence entre la branche main et la branche develop ?</w:t>
+        <w:t>Q2. Combien de colonnes votre tableau Kanban possède-t-il ? Quelle est la règle WIP ?</w:t>
+      </w:r>
+    </w:p>
+    <w:p>
+      <w:pPr>
+        <w:spacing w:after="4" w:line="261" w:lineRule="auto"/>
+        <w:ind w:left="705" w:right="14"/>
+        <w:jc w:val="both"/>
+        <w:rPr>
+          <w:color w:val="FF0000"/>
+          <w:lang w:val="fr-FR"/>
+        </w:rPr>
+      </w:pPr>
+      <w:r>
+        <w:rPr>
+          <w:color w:val="FF0000"/>
+          <w:lang w:val="fr-FR"/>
+        </w:rPr>
+        <w:t>Il y a 6 colonnes dans notre tableau Kanban</w:t>
+      </w:r>
+      <w:r>
+        <w:rPr>
+          <w:color w:val="FF0000"/>
+          <w:lang w:val="fr-FR"/>
+        </w:rPr>
+        <w:t xml:space="preserve">. </w:t>
+      </w:r>
+      <w:r>
+        <w:rPr>
+          <w:color w:val="FF0000"/>
+          <w:lang w:val="fr-FR"/>
+        </w:rPr>
+        <w:t>La limite WIP (Work In Progress) est fixée à 1 tâche « En cours » par étudiant à la fois. Fini</w:t>
+      </w:r>
+      <w:r>
+        <w:rPr>
+          <w:color w:val="FF0000"/>
+          <w:lang w:val="fr-FR"/>
+        </w:rPr>
+        <w:t xml:space="preserve">r </w:t>
+      </w:r>
+      <w:r>
+        <w:rPr>
+          <w:color w:val="FF0000"/>
+          <w:lang w:val="fr-FR"/>
+        </w:rPr>
+        <w:t>ce que</w:t>
+      </w:r>
+      <w:r>
+        <w:rPr>
+          <w:color w:val="FF0000"/>
+          <w:lang w:val="fr-FR"/>
+        </w:rPr>
+        <w:t xml:space="preserve"> nous avons commencer </w:t>
+      </w:r>
+      <w:r>
+        <w:rPr>
+          <w:color w:val="FF0000"/>
+          <w:lang w:val="fr-FR"/>
+        </w:rPr>
+        <w:t>avant de choisir une autre tâche.</w:t>
       </w:r>
     </w:p>
     <w:p>
@@ -8011,7 +8245,7 @@
         <w:rPr>
           <w:lang w:val="fr-FR"/>
         </w:rPr>
-        <w:t>Q4. Quel est le format d'un bon message de commit pour ce projet ?</w:t>
+        <w:t>Q3. Quelle est la différence entre la branche main et la branche develop ?</w:t>
       </w:r>
     </w:p>
     <w:p>
@@ -8029,9 +8263,111 @@
       </w:pPr>
       <w:r>
         <w:rPr>
+          <w:color w:val="FF0000"/>
+          <w:lang w:val="fr-FR"/>
+        </w:rPr>
+        <w:t xml:space="preserve">La branche develop est la ou a toute la partie dev et les test qui </w:t>
+      </w:r>
+      <w:r>
+        <w:rPr>
+          <w:color w:val="FF0000"/>
+          <w:lang w:val="fr-FR"/>
+        </w:rPr>
+        <w:t>ont réussi alors que main est la branche finale ou on rend le projet sur cette branche.</w:t>
+      </w:r>
+    </w:p>
+    <w:p>
+      <w:pPr>
+        <w:numPr>
+          <w:ilvl w:val="0"/>
+          <w:numId w:val="6"/>
+        </w:numPr>
+        <w:spacing w:after="4" w:line="261" w:lineRule="auto"/>
+        <w:ind w:right="14" w:hanging="360"/>
+        <w:jc w:val="both"/>
+        <w:rPr>
+          <w:lang w:val="fr-FR"/>
+        </w:rPr>
+      </w:pPr>
+      <w:r>
+        <w:rPr>
+          <w:lang w:val="fr-FR"/>
+        </w:rPr>
+        <w:t>Q4. Quel est le format d'un bon message de commit pour ce projet ?</w:t>
+      </w:r>
+      <w:r>
+        <w:rPr>
+          <w:rFonts w:ascii="Courier New" w:eastAsia="Courier New" w:hAnsi="Courier New" w:cs="Courier New"/>
+          <w:color w:val="00FF7F"/>
+          <w:sz w:val="18"/>
+          <w:lang w:val="fr-FR"/>
+        </w:rPr>
+        <w:t xml:space="preserve"> </w:t>
+      </w:r>
+    </w:p>
+    <w:p>
+      <w:pPr>
+        <w:spacing w:after="4" w:line="261" w:lineRule="auto"/>
+        <w:ind w:left="705" w:right="14"/>
+        <w:jc w:val="both"/>
+        <w:rPr>
+          <w:color w:val="FF0000"/>
+          <w:lang w:val="fr-FR"/>
+        </w:rPr>
+      </w:pPr>
+      <w:r>
+        <w:rPr>
+          <w:color w:val="FF0000"/>
+          <w:lang w:val="fr-FR"/>
+        </w:rPr>
+        <w:t>« le type de modif »</w:t>
+      </w:r>
+      <w:r>
+        <w:rPr>
+          <w:color w:val="FF0000"/>
+          <w:lang w:val="fr-FR"/>
+        </w:rPr>
+        <w:t> « le service » : « une description de l’action faites »</w:t>
+      </w:r>
+    </w:p>
+    <w:p>
+      <w:pPr>
+        <w:numPr>
+          <w:ilvl w:val="0"/>
+          <w:numId w:val="6"/>
+        </w:numPr>
+        <w:spacing w:after="4" w:line="261" w:lineRule="auto"/>
+        <w:ind w:right="14" w:hanging="360"/>
+        <w:jc w:val="both"/>
+        <w:rPr>
+          <w:lang w:val="fr-FR"/>
+        </w:rPr>
+      </w:pPr>
+      <w:r>
+        <w:rPr>
           <w:lang w:val="fr-FR"/>
         </w:rPr>
         <w:t>Q5. Combien d'issues avez-vous créées dans GitHub ? Sont-elles toutes assignées et dans le Project ?</w:t>
+      </w:r>
+      <w:r>
+        <w:rPr>
+          <w:lang w:val="fr-FR"/>
+        </w:rPr>
+        <w:t xml:space="preserve"> </w:t>
+      </w:r>
+      <w:r>
+        <w:rPr>
+          <w:color w:val="FF0000"/>
+          <w:lang w:val="fr-FR"/>
+        </w:rPr>
+        <w:t>On en a créer 17 issues sur GitHub</w:t>
+      </w:r>
+      <w:r>
+        <w:rPr>
+          <w:color w:val="FF0000"/>
+          <w:lang w:val="fr-FR"/>
+        </w:rPr>
+        <w:t>.</w:t>
       </w:r>
     </w:p>
     <w:p>
@@ -8067,6 +8403,7 @@
         <w:ind w:left="135"/>
       </w:pPr>
       <w:r>
+        <w:lastRenderedPageBreak/>
         <w:t>Étape 2.1 — Environnement et dépendances</w:t>
       </w:r>
     </w:p>
@@ -8204,7 +8541,7 @@
               </wp:inline>
             </w:drawing>
           </mc:Choice>
-          <mc:Fallback xmlns:a="http://schemas.openxmlformats.org/drawingml/2006/main" xmlns:w16sdtfl="http://schemas.microsoft.com/office/word/2024/wordml/sdtformatlock" xmlns:w16du="http://schemas.microsoft.com/office/word/2023/wordml/word16du" xmlns:oel="http://schemas.microsoft.com/office/2019/extlst">
+          <mc:Fallback xmlns:oel="http://schemas.microsoft.com/office/2019/extlst" xmlns:w16du="http://schemas.microsoft.com/office/word/2023/wordml/word16du" xmlns:w16sdtfl="http://schemas.microsoft.com/office/word/2024/wordml/sdtformatlock" xmlns:a="http://schemas.openxmlformats.org/drawingml/2006/main">
             <w:pict>
               <v:group id="Group 53945" style="width:475.25pt;height:0.5pt;mso-position-horizontal-relative:char;mso-position-vertical-relative:line" coordsize="60356,63">
                 <v:shape id="Shape 5879" style="position:absolute;width:60356;height:0;left:0;top:0;" coordsize="6035675,0" path="m6035675,0l0,0">
@@ -8266,7 +8603,6 @@
                 <w:sz w:val="18"/>
                 <w:lang w:val="fr-FR"/>
               </w:rPr>
-              <w:lastRenderedPageBreak/>
               <w:t># Naviguer dans le dossier du service cd service1_matrices</w:t>
             </w:r>
           </w:p>
@@ -8460,7 +8796,7 @@
               </wp:inline>
             </w:drawing>
           </mc:Choice>
-          <mc:Fallback xmlns:a="http://schemas.openxmlformats.org/drawingml/2006/main" xmlns:w16sdtfl="http://schemas.microsoft.com/office/word/2024/wordml/sdtformatlock" xmlns:w16du="http://schemas.microsoft.com/office/word/2023/wordml/word16du" xmlns:oel="http://schemas.microsoft.com/office/2019/extlst">
+          <mc:Fallback xmlns:oel="http://schemas.microsoft.com/office/2019/extlst" xmlns:w16du="http://schemas.microsoft.com/office/word/2023/wordml/word16du" xmlns:w16sdtfl="http://schemas.microsoft.com/office/word/2024/wordml/sdtformatlock" xmlns:a="http://schemas.openxmlformats.org/drawingml/2006/main">
             <w:pict>
               <v:group id="Group 53946" style="width:475.25pt;height:0.5pt;mso-position-horizontal-relative:char;mso-position-vertical-relative:line" coordsize="60356,63">
                 <v:shape id="Shape 5880" style="position:absolute;width:60356;height:0;left:0;top:0;" coordsize="6035675,0" path="m6035675,0l0,0">
@@ -8696,7 +9032,7 @@
               </wp:inline>
             </w:drawing>
           </mc:Choice>
-          <mc:Fallback xmlns:a="http://schemas.openxmlformats.org/drawingml/2006/main" xmlns:w16sdtfl="http://schemas.microsoft.com/office/word/2024/wordml/sdtformatlock" xmlns:w16du="http://schemas.microsoft.com/office/word/2023/wordml/word16du" xmlns:oel="http://schemas.microsoft.com/office/2019/extlst">
+          <mc:Fallback xmlns:oel="http://schemas.microsoft.com/office/2019/extlst" xmlns:w16du="http://schemas.microsoft.com/office/word/2023/wordml/word16du" xmlns:w16sdtfl="http://schemas.microsoft.com/office/word/2024/wordml/sdtformatlock" xmlns:a="http://schemas.openxmlformats.org/drawingml/2006/main">
             <w:pict>
               <v:group id="Group 53947" style="width:475.25pt;height:0.5pt;mso-position-horizontal-relative:char;mso-position-vertical-relative:line" coordsize="60356,63">
                 <v:shape id="Shape 5881" style="position:absolute;width:60356;height:0;left:0;top:0;" coordsize="6035675,0" path="m6035675,0l0,0">
@@ -9475,9 +9811,6 @@
             <w:pPr>
               <w:spacing w:line="334" w:lineRule="auto"/>
               <w:ind w:right="670"/>
-              <w:rPr>
-                <w:lang w:val="fr-FR"/>
-              </w:rPr>
             </w:pPr>
             <w:r>
               <w:rPr>
@@ -9492,7 +9825,6 @@
                 <w:rFonts w:ascii="Courier New" w:eastAsia="Courier New" w:hAnsi="Courier New" w:cs="Courier New"/>
                 <w:color w:val="00FF7F"/>
                 <w:sz w:val="18"/>
-                <w:lang w:val="fr-FR"/>
               </w:rPr>
               <w:t>return jsonify({'erreur': 'La matrice doit etre carree'}), 400         det = np.linalg.det(A)         if abs(det) &lt; 1e-10:</w:t>
             </w:r>
@@ -9507,7 +9839,6 @@
                 <w:rFonts w:ascii="Courier New" w:eastAsia="Courier New" w:hAnsi="Courier New" w:cs="Courier New"/>
                 <w:color w:val="00FF7F"/>
                 <w:sz w:val="18"/>
-                <w:lang w:val="fr-FR"/>
               </w:rPr>
               <w:t xml:space="preserve">            </w:t>
             </w:r>
@@ -10115,7 +10446,7 @@
               </wp:inline>
             </w:drawing>
           </mc:Choice>
-          <mc:Fallback xmlns:a="http://schemas.openxmlformats.org/drawingml/2006/main" xmlns:w16sdtfl="http://schemas.microsoft.com/office/word/2024/wordml/sdtformatlock" xmlns:w16du="http://schemas.microsoft.com/office/word/2023/wordml/word16du" xmlns:oel="http://schemas.microsoft.com/office/2019/extlst">
+          <mc:Fallback xmlns:oel="http://schemas.microsoft.com/office/2019/extlst" xmlns:w16du="http://schemas.microsoft.com/office/word/2023/wordml/word16du" xmlns:w16sdtfl="http://schemas.microsoft.com/office/word/2024/wordml/sdtformatlock" xmlns:a="http://schemas.openxmlformats.org/drawingml/2006/main">
             <w:pict>
               <v:group id="Group 45149" style="width:475.25pt;height:0.5pt;mso-position-horizontal-relative:char;mso-position-vertical-relative:line" coordsize="60356,63">
                 <v:shape id="Shape 6195" style="position:absolute;width:60356;height:0;left:0;top:0;" coordsize="6035675,0" path="m6035675,0l0,0">
@@ -10438,7 +10769,7 @@
               </wp:inline>
             </w:drawing>
           </mc:Choice>
-          <mc:Fallback xmlns:a="http://schemas.openxmlformats.org/drawingml/2006/main" xmlns:w16sdtfl="http://schemas.microsoft.com/office/word/2024/wordml/sdtformatlock" xmlns:w16du="http://schemas.microsoft.com/office/word/2023/wordml/word16du" xmlns:oel="http://schemas.microsoft.com/office/2019/extlst">
+          <mc:Fallback xmlns:oel="http://schemas.microsoft.com/office/2019/extlst" xmlns:w16du="http://schemas.microsoft.com/office/word/2023/wordml/word16du" xmlns:w16sdtfl="http://schemas.microsoft.com/office/word/2024/wordml/sdtformatlock" xmlns:a="http://schemas.openxmlformats.org/drawingml/2006/main">
             <w:pict>
               <v:group id="Group 51696" style="width:475.25pt;height:0.5pt;mso-position-horizontal-relative:char;mso-position-vertical-relative:line" coordsize="60356,63">
                 <v:shape id="Shape 6319" style="position:absolute;width:60356;height:0;left:0;top:0;" coordsize="6035675,0" path="m6035675,0l0,0">
@@ -12210,7 +12541,7 @@
               </wp:inline>
             </w:drawing>
           </mc:Choice>
-          <mc:Fallback xmlns:a="http://schemas.openxmlformats.org/drawingml/2006/main" xmlns:w16sdtfl="http://schemas.microsoft.com/office/word/2024/wordml/sdtformatlock" xmlns:w16du="http://schemas.microsoft.com/office/word/2023/wordml/word16du" xmlns:oel="http://schemas.microsoft.com/office/2019/extlst">
+          <mc:Fallback xmlns:oel="http://schemas.microsoft.com/office/2019/extlst" xmlns:w16du="http://schemas.microsoft.com/office/word/2023/wordml/word16du" xmlns:w16sdtfl="http://schemas.microsoft.com/office/word/2024/wordml/sdtformatlock" xmlns:a="http://schemas.openxmlformats.org/drawingml/2006/main">
             <w:pict>
               <v:group id="Group 57263" style="width:475.25pt;height:0.5pt;mso-position-horizontal-relative:char;mso-position-vertical-relative:line" coordsize="60356,63">
                 <v:shape id="Shape 6684" style="position:absolute;width:60356;height:0;left:0;top:0;" coordsize="6035675,0" path="m6035675,0l0,0">
@@ -12501,7 +12832,7 @@
               </wp:inline>
             </w:drawing>
           </mc:Choice>
-          <mc:Fallback xmlns:a="http://schemas.openxmlformats.org/drawingml/2006/main" xmlns:w16sdtfl="http://schemas.microsoft.com/office/word/2024/wordml/sdtformatlock" xmlns:w16du="http://schemas.microsoft.com/office/word/2023/wordml/word16du" xmlns:oel="http://schemas.microsoft.com/office/2019/extlst">
+          <mc:Fallback xmlns:oel="http://schemas.microsoft.com/office/2019/extlst" xmlns:w16du="http://schemas.microsoft.com/office/word/2023/wordml/word16du" xmlns:w16sdtfl="http://schemas.microsoft.com/office/word/2024/wordml/sdtformatlock" xmlns:a="http://schemas.openxmlformats.org/drawingml/2006/main">
             <w:pict>
               <v:group id="Group 59971" style="width:475.25pt;height:0.5pt;mso-position-horizontal-relative:char;mso-position-vertical-relative:line" coordsize="60356,63">
                 <v:shape id="Shape 6807" style="position:absolute;width:60356;height:0;left:0;top:0;" coordsize="6035675,0" path="m6035675,0l0,0">
@@ -12860,7 +13191,7 @@
         <w:spacing w:after="59" w:line="334" w:lineRule="auto"/>
         <w:ind w:left="175" w:right="2209" w:hanging="10"/>
         <w:rPr>
-          <w:lang w:val="en-GB"/>
+          <w:lang w:val="fr-FR"/>
         </w:rPr>
       </w:pPr>
       <w:r>
@@ -12868,7 +13199,7 @@
           <w:rFonts w:ascii="Courier New" w:eastAsia="Courier New" w:hAnsi="Courier New" w:cs="Courier New"/>
           <w:color w:val="00FF7F"/>
           <w:sz w:val="18"/>
-          <w:lang w:val="en-GB"/>
+          <w:lang w:val="fr-FR"/>
         </w:rPr>
         <w:t>cd service3_stats_mysql python -m venv venv &amp;&amp; source venv/bin/activate pip install flask mysql-connector-python numpy scipy python-dotenv pip freeze &gt; requirements.txt</w:t>
       </w:r>
@@ -12879,7 +13210,7 @@
         <w:ind w:left="10" w:right="14" w:hanging="10"/>
         <w:jc w:val="both"/>
         <w:rPr>
-          <w:lang w:val="en-GB"/>
+          <w:lang w:val="fr-FR"/>
         </w:rPr>
       </w:pPr>
     </w:p>
@@ -12999,12 +13330,16 @@
         <w:shd w:val="clear" w:color="auto" w:fill="2C3E50"/>
         <w:spacing w:after="482" w:line="265" w:lineRule="auto"/>
         <w:ind w:left="175" w:hanging="10"/>
+        <w:rPr>
+          <w:lang w:val="fr-FR"/>
+        </w:rPr>
       </w:pPr>
       <w:r>
         <w:rPr>
           <w:rFonts w:ascii="Courier New" w:eastAsia="Courier New" w:hAnsi="Courier New" w:cs="Courier New"/>
           <w:color w:val="00FF7F"/>
           <w:sz w:val="18"/>
+          <w:lang w:val="fr-FR"/>
         </w:rPr>
         <w:t>DB_NAME=flask_stats</w:t>
       </w:r>
@@ -13203,7 +13538,7 @@
               </wp:inline>
             </w:drawing>
           </mc:Choice>
-          <mc:Fallback xmlns:a="http://schemas.openxmlformats.org/drawingml/2006/main" xmlns:w16sdtfl="http://schemas.microsoft.com/office/word/2024/wordml/sdtformatlock" xmlns:w16du="http://schemas.microsoft.com/office/word/2023/wordml/word16du" xmlns:oel="http://schemas.microsoft.com/office/2019/extlst">
+          <mc:Fallback xmlns:oel="http://schemas.microsoft.com/office/2019/extlst" xmlns:w16du="http://schemas.microsoft.com/office/word/2023/wordml/word16du" xmlns:w16sdtfl="http://schemas.microsoft.com/office/word/2024/wordml/sdtformatlock" xmlns:a="http://schemas.openxmlformats.org/drawingml/2006/main">
             <w:pict>
               <v:group id="Group 55208" style="width:475.25pt;height:0.5pt;mso-position-horizontal-relative:char;mso-position-vertical-relative:line" coordsize="60356,63">
                 <v:shape id="Shape 6974" style="position:absolute;width:60356;height:0;left:0;top:0;" coordsize="6035675,0" path="m6035675,0l0,0">
@@ -14454,7 +14789,7 @@
               </wp:inline>
             </w:drawing>
           </mc:Choice>
-          <mc:Fallback xmlns:a="http://schemas.openxmlformats.org/drawingml/2006/main" xmlns:w16sdtfl="http://schemas.microsoft.com/office/word/2024/wordml/sdtformatlock" xmlns:w16du="http://schemas.microsoft.com/office/word/2023/wordml/word16du" xmlns:oel="http://schemas.microsoft.com/office/2019/extlst">
+          <mc:Fallback xmlns:oel="http://schemas.microsoft.com/office/2019/extlst" xmlns:w16du="http://schemas.microsoft.com/office/word/2023/wordml/word16du" xmlns:w16sdtfl="http://schemas.microsoft.com/office/word/2024/wordml/sdtformatlock" xmlns:a="http://schemas.openxmlformats.org/drawingml/2006/main">
             <w:pict>
               <v:group id="Group 57479" style="width:475.25pt;height:0.5pt;mso-position-horizontal-relative:char;mso-position-vertical-relative:line" coordsize="60356,63">
                 <v:shape id="Shape 7257" style="position:absolute;width:60356;height:0;left:0;top:0;" coordsize="6035675,0" path="m6035675,0l0,0">
@@ -15385,7 +15720,7 @@
               </wp:inline>
             </w:drawing>
           </mc:Choice>
-          <mc:Fallback xmlns:a="http://schemas.openxmlformats.org/drawingml/2006/main" xmlns:w16sdtfl="http://schemas.microsoft.com/office/word/2024/wordml/sdtformatlock" xmlns:w16du="http://schemas.microsoft.com/office/word/2023/wordml/word16du" xmlns:oel="http://schemas.microsoft.com/office/2019/extlst">
+          <mc:Fallback xmlns:oel="http://schemas.microsoft.com/office/2019/extlst" xmlns:w16du="http://schemas.microsoft.com/office/word/2023/wordml/word16du" xmlns:w16sdtfl="http://schemas.microsoft.com/office/word/2024/wordml/sdtformatlock" xmlns:a="http://schemas.openxmlformats.org/drawingml/2006/main">
             <w:pict>
               <v:group id="Group 44322" style="width:475.25pt;height:0.5pt;mso-position-horizontal-relative:char;mso-position-vertical-relative:line" coordsize="60356,63">
                 <v:shape id="Shape 7451" style="position:absolute;width:60356;height:0;left:0;top:0;" coordsize="6035675,0" path="m6035675,0l0,0">
@@ -15492,7 +15827,7 @@
         <w:spacing w:after="606" w:line="334" w:lineRule="auto"/>
         <w:ind w:left="175" w:right="2749" w:hanging="10"/>
         <w:rPr>
-          <w:lang w:val="en-GB"/>
+          <w:lang w:val="fr-FR"/>
         </w:rPr>
       </w:pPr>
       <w:r>
@@ -15500,7 +15835,7 @@
           <w:rFonts w:ascii="Courier New" w:eastAsia="Courier New" w:hAnsi="Courier New" w:cs="Courier New"/>
           <w:color w:val="00FF7F"/>
           <w:sz w:val="18"/>
-          <w:lang w:val="en-GB"/>
+          <w:lang w:val="fr-FR"/>
         </w:rPr>
         <w:t>cd service4_csv_mysql python -m venv venv &amp;&amp; source venv/bin/activate pip install flask pandas mysql-connector-python python-dotenv pip freeze &gt; requirements.txt</w:t>
       </w:r>
@@ -15916,6 +16251,9 @@
           <w:p>
             <w:pPr>
               <w:spacing w:after="63"/>
+              <w:rPr>
+                <w:lang w:val="fr-FR"/>
+              </w:rPr>
             </w:pPr>
             <w:r>
               <w:rPr>
@@ -15931,6 +16269,7 @@
                 <w:rFonts w:ascii="Courier New" w:eastAsia="Courier New" w:hAnsi="Courier New" w:cs="Courier New"/>
                 <w:color w:val="00FF7F"/>
                 <w:sz w:val="18"/>
+                <w:lang w:val="fr-FR"/>
               </w:rPr>
               <w:t>'manquantes': list(colonnes_manquantes)</w:t>
             </w:r>
@@ -15938,12 +16277,16 @@
           <w:p>
             <w:pPr>
               <w:spacing w:after="396"/>
-            </w:pPr>
-            <w:r>
-              <w:rPr>
-                <w:rFonts w:ascii="Courier New" w:eastAsia="Courier New" w:hAnsi="Courier New" w:cs="Courier New"/>
-                <w:color w:val="00FF7F"/>
-                <w:sz w:val="18"/>
+              <w:rPr>
+                <w:lang w:val="fr-FR"/>
+              </w:rPr>
+            </w:pPr>
+            <w:r>
+              <w:rPr>
+                <w:rFonts w:ascii="Courier New" w:eastAsia="Courier New" w:hAnsi="Courier New" w:cs="Courier New"/>
+                <w:color w:val="00FF7F"/>
+                <w:sz w:val="18"/>
+                <w:lang w:val="fr-FR"/>
               </w:rPr>
               <w:t xml:space="preserve">        }), 400</w:t>
             </w:r>
@@ -15952,12 +16295,16 @@
             <w:pPr>
               <w:spacing w:after="333" w:line="334" w:lineRule="auto"/>
               <w:ind w:right="1858"/>
-            </w:pPr>
-            <w:r>
-              <w:rPr>
-                <w:rFonts w:ascii="Courier New" w:eastAsia="Courier New" w:hAnsi="Courier New" w:cs="Courier New"/>
-                <w:color w:val="00FF7F"/>
-                <w:sz w:val="18"/>
+              <w:rPr>
+                <w:lang w:val="fr-FR"/>
+              </w:rPr>
+            </w:pPr>
+            <w:r>
+              <w:rPr>
+                <w:rFonts w:ascii="Courier New" w:eastAsia="Courier New" w:hAnsi="Courier New" w:cs="Courier New"/>
+                <w:color w:val="00FF7F"/>
+                <w:sz w:val="18"/>
+                <w:lang w:val="fr-FR"/>
               </w:rPr>
               <w:t xml:space="preserve">    # 4. Nettoyer les données     df = df[[c for c in df.columns if c in COLONNES_VALIDES]]     df['valeur'] = pd.to_numeric(df['valeur'], errors='coerce')     lignes_invalides = df['valeur'].isna().sum()     df.dropna(subset=['valeur'], inplace=True)</w:t>
             </w:r>
@@ -15975,6 +16322,7 @@
                 <w:rFonts w:ascii="Courier New" w:eastAsia="Courier New" w:hAnsi="Courier New" w:cs="Courier New"/>
                 <w:color w:val="00FF7F"/>
                 <w:sz w:val="18"/>
+                <w:lang w:val="fr-FR"/>
               </w:rPr>
               <w:t xml:space="preserve">    </w:t>
             </w:r>
@@ -16143,12 +16491,16 @@
           <w:p>
             <w:pPr>
               <w:spacing w:after="396"/>
-            </w:pPr>
-            <w:r>
-              <w:rPr>
-                <w:rFonts w:ascii="Courier New" w:eastAsia="Courier New" w:hAnsi="Courier New" w:cs="Courier New"/>
-                <w:color w:val="00FF7F"/>
-                <w:sz w:val="18"/>
+              <w:rPr>
+                <w:lang w:val="fr-FR"/>
+              </w:rPr>
+            </w:pPr>
+            <w:r>
+              <w:rPr>
+                <w:rFonts w:ascii="Courier New" w:eastAsia="Courier New" w:hAnsi="Courier New" w:cs="Courier New"/>
+                <w:color w:val="00FF7F"/>
+                <w:sz w:val="18"/>
+                <w:lang w:val="fr-FR"/>
               </w:rPr>
               <w:t>500</w:t>
             </w:r>
@@ -16166,6 +16518,7 @@
                 <w:rFonts w:ascii="Courier New" w:eastAsia="Courier New" w:hAnsi="Courier New" w:cs="Courier New"/>
                 <w:color w:val="00FF7F"/>
                 <w:sz w:val="18"/>
+                <w:lang w:val="fr-FR"/>
               </w:rPr>
               <w:t xml:space="preserve">    </w:t>
             </w:r>
@@ -17185,7 +17538,7 @@
               </wp:inline>
             </w:drawing>
           </mc:Choice>
-          <mc:Fallback xmlns:a="http://schemas.openxmlformats.org/drawingml/2006/main" xmlns:w16sdtfl="http://schemas.microsoft.com/office/word/2024/wordml/sdtformatlock" xmlns:w16du="http://schemas.microsoft.com/office/word/2023/wordml/word16du" xmlns:oel="http://schemas.microsoft.com/office/2019/extlst">
+          <mc:Fallback xmlns:oel="http://schemas.microsoft.com/office/2019/extlst" xmlns:w16du="http://schemas.microsoft.com/office/word/2023/wordml/word16du" xmlns:w16sdtfl="http://schemas.microsoft.com/office/word/2024/wordml/sdtformatlock" xmlns:a="http://schemas.openxmlformats.org/drawingml/2006/main">
             <w:pict>
               <v:group id="Group 56815" style="width:475.25pt;height:0.5pt;mso-position-horizontal-relative:char;mso-position-vertical-relative:line" coordsize="60356,63">
                 <v:shape id="Shape 8000" style="position:absolute;width:60356;height:0;left:0;top:0;" coordsize="6035675,0" path="m6035675,0l0,0">
@@ -17558,7 +17911,7 @@
               </wp:inline>
             </w:drawing>
           </mc:Choice>
-          <mc:Fallback xmlns:w16sdtfl="http://schemas.microsoft.com/office/word/2024/wordml/sdtformatlock" xmlns:w16du="http://schemas.microsoft.com/office/word/2023/wordml/word16du" xmlns:oel="http://schemas.microsoft.com/office/2019/extlst">
+          <mc:Fallback xmlns:oel="http://schemas.microsoft.com/office/2019/extlst" xmlns:w16du="http://schemas.microsoft.com/office/word/2023/wordml/word16du" xmlns:w16sdtfl="http://schemas.microsoft.com/office/word/2024/wordml/sdtformatlock">
             <w:pict>
               <v:group w14:anchorId="45D2F1E8" id="Group 82862" o:spid="_x0000_s1026" style="width:475.25pt;height:.5pt;mso-position-horizontal-relative:char;mso-position-vertical-relative:line" coordsize="60356,63" o:gfxdata="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">
                 <v:shape id="Shape 11542" o:spid="_x0000_s1027" style="position:absolute;width:60356;height:0;visibility:visible;mso-wrap-style:square;v-text-anchor:top" coordsize="6035675,0" o:gfxdata="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" path="m6035675,l,e" filled="f" strokecolor="#d5e8f0" strokeweight=".5pt">
@@ -18198,7 +18551,7 @@
               </wp:inline>
             </w:drawing>
           </mc:Choice>
-          <mc:Fallback xmlns:w16sdtfl="http://schemas.microsoft.com/office/word/2024/wordml/sdtformatlock" xmlns:w16du="http://schemas.microsoft.com/office/word/2023/wordml/word16du" xmlns:oel="http://schemas.microsoft.com/office/2019/extlst">
+          <mc:Fallback xmlns:oel="http://schemas.microsoft.com/office/2019/extlst" xmlns:w16du="http://schemas.microsoft.com/office/word/2023/wordml/word16du" xmlns:w16sdtfl="http://schemas.microsoft.com/office/word/2024/wordml/sdtformatlock">
             <w:pict>
               <v:group w14:anchorId="7A8037F3" id="Group 82863" o:spid="_x0000_s1026" style="width:475.25pt;height:.5pt;mso-position-horizontal-relative:char;mso-position-vertical-relative:line" coordsize="60356,63" o:gfxdata="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">
                 <v:shape id="Shape 11543" o:spid="_x0000_s1027" style="position:absolute;width:60356;height:0;visibility:visible;mso-wrap-style:square;v-text-anchor:top" coordsize="6035675,0" o:gfxdata="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" path="m6035675,l,e" filled="f" strokecolor="#d5e8f0" strokeweight=".5pt">
@@ -19719,15 +20072,15 @@
             <w:pPr>
               <w:spacing w:after="396"/>
               <w:rPr>
-                <w:lang w:val="fr-FR"/>
-              </w:rPr>
-            </w:pPr>
-            <w:r>
-              <w:rPr>
-                <w:rFonts w:ascii="Courier New" w:eastAsia="Courier New" w:hAnsi="Courier New" w:cs="Courier New"/>
-                <w:color w:val="00FF7F"/>
-                <w:sz w:val="18"/>
-                <w:lang w:val="fr-FR"/>
+                <w:lang w:val="en-GB"/>
+              </w:rPr>
+            </w:pPr>
+            <w:r>
+              <w:rPr>
+                <w:rFonts w:ascii="Courier New" w:eastAsia="Courier New" w:hAnsi="Courier New" w:cs="Courier New"/>
+                <w:color w:val="00FF7F"/>
+                <w:sz w:val="18"/>
+                <w:lang w:val="en-GB"/>
               </w:rPr>
               <w:t>OUT_FILE="${LIB_DIR}/stats.so"</w:t>
             </w:r>
@@ -20394,12 +20747,16 @@
             <w:pPr>
               <w:spacing w:after="333" w:line="334" w:lineRule="auto"/>
               <w:ind w:right="4342"/>
-            </w:pPr>
-            <w:r>
-              <w:rPr>
-                <w:rFonts w:ascii="Courier New" w:eastAsia="Courier New" w:hAnsi="Courier New" w:cs="Courier New"/>
-                <w:color w:val="00FF7F"/>
-                <w:sz w:val="18"/>
+              <w:rPr>
+                <w:lang w:val="fr-FR"/>
+              </w:rPr>
+            </w:pPr>
+            <w:r>
+              <w:rPr>
+                <w:rFonts w:ascii="Courier New" w:eastAsia="Courier New" w:hAnsi="Courier New" w:cs="Courier New"/>
+                <w:color w:val="00FF7F"/>
+                <w:sz w:val="18"/>
+                <w:lang w:val="fr-FR"/>
               </w:rPr>
               <w:t># c_bridge.py — Pont Python/C via ctypes import ctypes import os import platform</w:t>
             </w:r>
@@ -20408,22 +20765,32 @@
             <w:pPr>
               <w:spacing w:after="333" w:line="334" w:lineRule="auto"/>
               <w:ind w:right="1534"/>
-            </w:pPr>
-            <w:r>
-              <w:rPr>
-                <w:rFonts w:ascii="Courier New" w:eastAsia="Courier New" w:hAnsi="Courier New" w:cs="Courier New"/>
-                <w:color w:val="00FF7F"/>
-                <w:sz w:val="18"/>
+              <w:rPr>
+                <w:lang w:val="fr-FR"/>
+              </w:rPr>
+            </w:pPr>
+            <w:r>
+              <w:rPr>
+                <w:rFonts w:ascii="Courier New" w:eastAsia="Courier New" w:hAnsi="Courier New" w:cs="Courier New"/>
+                <w:color w:val="00FF7F"/>
+                <w:sz w:val="18"/>
+                <w:lang w:val="fr-FR"/>
               </w:rPr>
               <w:t># ─── Chargement de la bibliothèque ────────────────────────────── # Déterminer le nom du fichier selon le système d'exploitation _ext = '.so' if platform.system() == 'Darwin':   # macOS     _ext = '.dylib' elif platform.system() == 'Windows':     _ext = '.dll'</w:t>
             </w:r>
           </w:p>
           <w:p>
-            <w:r>
-              <w:rPr>
-                <w:rFonts w:ascii="Courier New" w:eastAsia="Courier New" w:hAnsi="Courier New" w:cs="Courier New"/>
-                <w:color w:val="00FF7F"/>
-                <w:sz w:val="18"/>
+            <w:pPr>
+              <w:rPr>
+                <w:lang w:val="fr-FR"/>
+              </w:rPr>
+            </w:pPr>
+            <w:r>
+              <w:rPr>
+                <w:rFonts w:ascii="Courier New" w:eastAsia="Courier New" w:hAnsi="Courier New" w:cs="Courier New"/>
+                <w:color w:val="00FF7F"/>
+                <w:sz w:val="18"/>
+                <w:lang w:val="fr-FR"/>
               </w:rPr>
               <w:t>_lib_path = os.path.join(os.path.dirname(__file__), 'lib', f'stats{_ext}')</w:t>
             </w:r>
@@ -20435,6 +20802,9 @@
       <w:pPr>
         <w:spacing w:after="0"/>
         <w:ind w:left="-1202" w:right="560"/>
+        <w:rPr>
+          <w:lang w:val="fr-FR"/>
+        </w:rPr>
       </w:pPr>
     </w:p>
     <w:tbl>
@@ -22330,7 +22700,7 @@
               </wp:inline>
             </w:drawing>
           </mc:Choice>
-          <mc:Fallback xmlns:w16sdtfl="http://schemas.microsoft.com/office/word/2024/wordml/sdtformatlock" xmlns:w16du="http://schemas.microsoft.com/office/word/2023/wordml/word16du" xmlns:oel="http://schemas.microsoft.com/office/2019/extlst">
+          <mc:Fallback xmlns:oel="http://schemas.microsoft.com/office/2019/extlst" xmlns:w16du="http://schemas.microsoft.com/office/word/2023/wordml/word16du" xmlns:w16sdtfl="http://schemas.microsoft.com/office/word/2024/wordml/sdtformatlock">
             <w:pict>
               <v:group w14:anchorId="58510B1F" id="Group 85545" o:spid="_x0000_s1026" style="width:475.25pt;height:.5pt;mso-position-horizontal-relative:char;mso-position-vertical-relative:line" coordsize="60356,63" o:gfxdata="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">
                 <v:shape id="Shape 12844" o:spid="_x0000_s1027" style="position:absolute;width:60356;height:0;visibility:visible;mso-wrap-style:square;v-text-anchor:top" coordsize="6035675,0" o:gfxdata="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" path="m6035675,l,e" filled="f" strokecolor="#d5e8f0" strokeweight=".5pt">
@@ -22990,7 +23360,7 @@
               </wp:inline>
             </w:drawing>
           </mc:Choice>
-          <mc:Fallback xmlns:w16sdtfl="http://schemas.microsoft.com/office/word/2024/wordml/sdtformatlock" xmlns:w16du="http://schemas.microsoft.com/office/word/2023/wordml/word16du" xmlns:oel="http://schemas.microsoft.com/office/2019/extlst">
+          <mc:Fallback xmlns:oel="http://schemas.microsoft.com/office/2019/extlst" xmlns:w16du="http://schemas.microsoft.com/office/word/2023/wordml/word16du" xmlns:w16sdtfl="http://schemas.microsoft.com/office/word/2024/wordml/sdtformatlock">
             <w:pict>
               <v:group w14:anchorId="3CFDBB96" id="Group 85546" o:spid="_x0000_s1026" style="width:475.25pt;height:.5pt;mso-position-horizontal-relative:char;mso-position-vertical-relative:line" coordsize="60356,63" o:gfxdata="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">
                 <v:shape id="Shape 12845" o:spid="_x0000_s1027" style="position:absolute;width:60356;height:0;visibility:visible;mso-wrap-style:square;v-text-anchor:top" coordsize="6035675,0" o:gfxdata="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" path="m6035675,l,e" filled="f" strokecolor="#d5e8f0" strokeweight=".5pt">
@@ -23213,16 +23583,12 @@
             <w:pPr>
               <w:spacing w:line="334" w:lineRule="auto"/>
               <w:ind w:right="3478"/>
-              <w:rPr>
-                <w:lang w:val="fr-FR"/>
-              </w:rPr>
-            </w:pPr>
-            <w:r>
-              <w:rPr>
-                <w:rFonts w:ascii="Courier New" w:eastAsia="Courier New" w:hAnsi="Courier New" w:cs="Courier New"/>
-                <w:color w:val="00FF7F"/>
-                <w:sz w:val="18"/>
-                <w:lang w:val="fr-FR"/>
+            </w:pPr>
+            <w:r>
+              <w:rPr>
+                <w:rFonts w:ascii="Courier New" w:eastAsia="Courier New" w:hAnsi="Courier New" w:cs="Courier New"/>
+                <w:color w:val="00FF7F"/>
+                <w:sz w:val="18"/>
               </w:rPr>
               <w:t># Test 2 : Produit scalaire curl -X POST http://localhost:5005/c/stats/dot \      -H 'Content-Type: application/json' \</w:t>
             </w:r>
@@ -23230,13 +23596,15 @@
           <w:p>
             <w:pPr>
               <w:spacing w:after="63"/>
-            </w:pPr>
-            <w:r>
-              <w:rPr>
-                <w:rFonts w:ascii="Courier New" w:eastAsia="Courier New" w:hAnsi="Courier New" w:cs="Courier New"/>
-                <w:color w:val="00FF7F"/>
-                <w:sz w:val="18"/>
-                <w:lang w:val="fr-FR"/>
+              <w:rPr>
+                <w:lang w:val="fr-FR"/>
+              </w:rPr>
+            </w:pPr>
+            <w:r>
+              <w:rPr>
+                <w:rFonts w:ascii="Courier New" w:eastAsia="Courier New" w:hAnsi="Courier New" w:cs="Courier New"/>
+                <w:color w:val="00FF7F"/>
+                <w:sz w:val="18"/>
               </w:rPr>
               <w:t xml:space="preserve">     </w:t>
             </w:r>
@@ -23245,6 +23613,7 @@
                 <w:rFonts w:ascii="Courier New" w:eastAsia="Courier New" w:hAnsi="Courier New" w:cs="Courier New"/>
                 <w:color w:val="00FF7F"/>
                 <w:sz w:val="18"/>
+                <w:lang w:val="fr-FR"/>
               </w:rPr>
               <w:t>-d '{"v1": [1, 2, 3], "v2": [4, 5, 6]}'</w:t>
             </w:r>
@@ -23361,12 +23730,16 @@
             <w:pPr>
               <w:spacing w:after="333" w:line="334" w:lineRule="auto"/>
               <w:ind w:right="3586"/>
-            </w:pPr>
-            <w:r>
-              <w:rPr>
-                <w:rFonts w:ascii="Courier New" w:eastAsia="Courier New" w:hAnsi="Courier New" w:cs="Courier New"/>
-                <w:color w:val="00FF7F"/>
-                <w:sz w:val="18"/>
+              <w:rPr>
+                <w:lang w:val="fr-FR"/>
+              </w:rPr>
+            </w:pPr>
+            <w:r>
+              <w:rPr>
+                <w:rFonts w:ascii="Courier New" w:eastAsia="Courier New" w:hAnsi="Courier New" w:cs="Courier New"/>
+                <w:color w:val="00FF7F"/>
+                <w:sz w:val="18"/>
+                <w:lang w:val="fr-FR"/>
               </w:rPr>
               <w:t># benchmark.py — Compare Python pur vs C/ctypes import time import c_bridge as C import random</w:t>
             </w:r>
@@ -24747,7 +25120,7 @@
               </wp:inline>
             </w:drawing>
           </mc:Choice>
-          <mc:Fallback xmlns:w16sdtfl="http://schemas.microsoft.com/office/word/2024/wordml/sdtformatlock" xmlns:w16du="http://schemas.microsoft.com/office/word/2023/wordml/word16du" xmlns:oel="http://schemas.microsoft.com/office/2019/extlst">
+          <mc:Fallback xmlns:oel="http://schemas.microsoft.com/office/2019/extlst" xmlns:w16du="http://schemas.microsoft.com/office/word/2023/wordml/word16du" xmlns:w16sdtfl="http://schemas.microsoft.com/office/word/2024/wordml/sdtformatlock">
             <w:pict>
               <v:group w14:anchorId="31CA7639" id="Group 86405" o:spid="_x0000_s1026" style="width:475.25pt;height:.5pt;mso-position-horizontal-relative:char;mso-position-vertical-relative:line" coordsize="60356,63" o:gfxdata="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">
                 <v:shape id="Shape 13213" o:spid="_x0000_s1027" style="position:absolute;width:60356;height:0;visibility:visible;mso-wrap-style:square;v-text-anchor:top" coordsize="6035675,0" o:gfxdata="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" path="m6035675,l,e" filled="f" strokecolor="#d5e8f0" strokeweight=".5pt">
@@ -25136,7 +25509,7 @@
               </wp:inline>
             </w:drawing>
           </mc:Choice>
-          <mc:Fallback xmlns:a="http://schemas.openxmlformats.org/drawingml/2006/main" xmlns:w16sdtfl="http://schemas.microsoft.com/office/word/2024/wordml/sdtformatlock" xmlns:w16du="http://schemas.microsoft.com/office/word/2023/wordml/word16du" xmlns:oel="http://schemas.microsoft.com/office/2019/extlst">
+          <mc:Fallback xmlns:oel="http://schemas.microsoft.com/office/2019/extlst" xmlns:w16du="http://schemas.microsoft.com/office/word/2023/wordml/word16du" xmlns:w16sdtfl="http://schemas.microsoft.com/office/word/2024/wordml/sdtformatlock" xmlns:a="http://schemas.openxmlformats.org/drawingml/2006/main">
             <w:pict>
               <v:group id="Group 57907" style="width:475.25pt;height:0.5pt;mso-position-horizontal-relative:char;mso-position-vertical-relative:line" coordsize="60356,63">
                 <v:shape id="Shape 8147" style="position:absolute;width:60356;height:0;left:0;top:0;" coordsize="6035675,0" path="m6035675,0l0,0">
@@ -25636,7 +26009,7 @@
               </wp:inline>
             </w:drawing>
           </mc:Choice>
-          <mc:Fallback xmlns:a="http://schemas.openxmlformats.org/drawingml/2006/main" xmlns:w16sdtfl="http://schemas.microsoft.com/office/word/2024/wordml/sdtformatlock" xmlns:w16du="http://schemas.microsoft.com/office/word/2023/wordml/word16du" xmlns:oel="http://schemas.microsoft.com/office/2019/extlst">
+          <mc:Fallback xmlns:oel="http://schemas.microsoft.com/office/2019/extlst" xmlns:w16du="http://schemas.microsoft.com/office/word/2023/wordml/word16du" xmlns:w16sdtfl="http://schemas.microsoft.com/office/word/2024/wordml/sdtformatlock" xmlns:a="http://schemas.openxmlformats.org/drawingml/2006/main">
             <w:pict>
               <v:group id="Group 57908" style="width:475.25pt;height:0.5pt;mso-position-horizontal-relative:char;mso-position-vertical-relative:line" coordsize="60356,63">
                 <v:shape id="Shape 8148" style="position:absolute;width:60356;height:0;left:0;top:0;" coordsize="6035675,0" path="m6035675,0l0,0">
@@ -26110,7 +26483,7 @@
               </wp:inline>
             </w:drawing>
           </mc:Choice>
-          <mc:Fallback xmlns:a="http://schemas.openxmlformats.org/drawingml/2006/main" xmlns:w16sdtfl="http://schemas.microsoft.com/office/word/2024/wordml/sdtformatlock" xmlns:w16du="http://schemas.microsoft.com/office/word/2023/wordml/word16du" xmlns:oel="http://schemas.microsoft.com/office/2019/extlst">
+          <mc:Fallback xmlns:oel="http://schemas.microsoft.com/office/2019/extlst" xmlns:w16du="http://schemas.microsoft.com/office/word/2023/wordml/word16du" xmlns:w16sdtfl="http://schemas.microsoft.com/office/word/2024/wordml/sdtformatlock" xmlns:a="http://schemas.openxmlformats.org/drawingml/2006/main">
             <w:pict>
               <v:group id="Group 59320" style="width:475.25pt;height:0.5pt;mso-position-horizontal-relative:char;mso-position-vertical-relative:line" coordsize="60356,63">
                 <v:shape id="Shape 8316" style="position:absolute;width:60356;height:0;left:0;top:0;" coordsize="6035675,0" path="m6035675,0l0,0">
@@ -30463,12 +30836,12 @@
       </w:pPr>
     </w:p>
     <w:sectPr>
-      <w:headerReference w:type="even" r:id="rId9"/>
-      <w:headerReference w:type="default" r:id="rId10"/>
-      <w:footerReference w:type="even" r:id="rId11"/>
-      <w:footerReference w:type="default" r:id="rId12"/>
-      <w:headerReference w:type="first" r:id="rId13"/>
-      <w:footerReference w:type="first" r:id="rId14"/>
+      <w:headerReference w:type="even" r:id="rId12"/>
+      <w:headerReference w:type="default" r:id="rId13"/>
+      <w:footerReference w:type="even" r:id="rId14"/>
+      <w:footerReference w:type="default" r:id="rId15"/>
+      <w:headerReference w:type="first" r:id="rId16"/>
+      <w:footerReference w:type="first" r:id="rId17"/>
       <w:pgSz w:w="11906" w:h="16838"/>
       <w:pgMar w:top="1200" w:right="1187" w:bottom="1211" w:left="1202" w:header="714" w:footer="708" w:gutter="0"/>
       <w:cols w:space="720"/>
@@ -30642,7 +31015,7 @@
             </wp:anchor>
           </w:drawing>
         </mc:Choice>
-        <mc:Fallback xmlns:a="http://schemas.openxmlformats.org/drawingml/2006/main" xmlns:w16sdtfl="http://schemas.microsoft.com/office/word/2024/wordml/sdtformatlock" xmlns:w16du="http://schemas.microsoft.com/office/word/2023/wordml/word16du" xmlns:oel="http://schemas.microsoft.com/office/2019/extlst">
+        <mc:Fallback xmlns:oel="http://schemas.microsoft.com/office/2019/extlst" xmlns:w16du="http://schemas.microsoft.com/office/word/2023/wordml/word16du" xmlns:w16sdtfl="http://schemas.microsoft.com/office/word/2024/wordml/sdtformatlock" xmlns:a="http://schemas.openxmlformats.org/drawingml/2006/main">
           <w:pict>
             <v:group id="Group 61490" style="width:475.25pt;height:0.75pt;position:absolute;mso-position-horizontal-relative:page;mso-position-horizontal:absolute;margin-left:60pt;mso-position-vertical-relative:page;margin-top:795.801pt;" coordsize="60356,95">
               <v:shape id="Shape 61491" style="position:absolute;width:60356;height:0;left:0;top:0;" coordsize="6035675,0" path="m0,0l6035675,0">
@@ -30817,7 +31190,7 @@
             </wp:anchor>
           </w:drawing>
         </mc:Choice>
-        <mc:Fallback xmlns:a="http://schemas.openxmlformats.org/drawingml/2006/main" xmlns:w16sdtfl="http://schemas.microsoft.com/office/word/2024/wordml/sdtformatlock" xmlns:w16du="http://schemas.microsoft.com/office/word/2023/wordml/word16du" xmlns:oel="http://schemas.microsoft.com/office/2019/extlst">
+        <mc:Fallback xmlns:oel="http://schemas.microsoft.com/office/2019/extlst" xmlns:w16du="http://schemas.microsoft.com/office/word/2023/wordml/word16du" xmlns:w16sdtfl="http://schemas.microsoft.com/office/word/2024/wordml/sdtformatlock" xmlns:a="http://schemas.openxmlformats.org/drawingml/2006/main">
           <w:pict>
             <v:group id="Group 61471" style="width:475.25pt;height:0.75pt;position:absolute;mso-position-horizontal-relative:page;mso-position-horizontal:absolute;margin-left:60pt;mso-position-vertical-relative:page;margin-top:795.801pt;" coordsize="60356,95">
               <v:shape id="Shape 61472" style="position:absolute;width:60356;height:0;left:0;top:0;" coordsize="6035675,0" path="m0,0l6035675,0">
@@ -30985,7 +31358,7 @@
             </wp:anchor>
           </w:drawing>
         </mc:Choice>
-        <mc:Fallback xmlns:a="http://schemas.openxmlformats.org/drawingml/2006/main" xmlns:w16sdtfl="http://schemas.microsoft.com/office/word/2024/wordml/sdtformatlock" xmlns:w16du="http://schemas.microsoft.com/office/word/2023/wordml/word16du" xmlns:oel="http://schemas.microsoft.com/office/2019/extlst">
+        <mc:Fallback xmlns:oel="http://schemas.microsoft.com/office/2019/extlst" xmlns:w16du="http://schemas.microsoft.com/office/word/2023/wordml/word16du" xmlns:w16sdtfl="http://schemas.microsoft.com/office/word/2024/wordml/sdtformatlock" xmlns:a="http://schemas.openxmlformats.org/drawingml/2006/main">
           <w:pict>
             <v:group id="Group 61452" style="width:475.25pt;height:0.75pt;position:absolute;mso-position-horizontal-relative:page;mso-position-horizontal:absolute;margin-left:60pt;mso-position-vertical-relative:page;margin-top:795.801pt;" coordsize="60356,95">
               <v:shape id="Shape 61453" style="position:absolute;width:60356;height:0;left:0;top:0;" coordsize="6035675,0" path="m0,0l6035675,0">
@@ -34543,6 +34916,7 @@
   <w:style w:type="paragraph" w:default="1" w:styleId="Normal">
     <w:name w:val="Normal"/>
     <w:qFormat/>
+    <w:rsid w:val="00557933"/>
     <w:pPr>
       <w:spacing w:line="259" w:lineRule="auto"/>
     </w:pPr>
@@ -34773,6 +35147,17 @@
     <w:name w:val="token"/>
     <w:basedOn w:val="Policepardfaut"/>
     <w:rsid w:val="00AA5DE6"/>
+  </w:style>
+  <w:style w:type="paragraph" w:styleId="Paragraphedeliste">
+    <w:name w:val="List Paragraph"/>
+    <w:basedOn w:val="Normal"/>
+    <w:uiPriority w:val="34"/>
+    <w:qFormat/>
+    <w:rsid w:val="00557933"/>
+    <w:pPr>
+      <w:ind w:left="720"/>
+      <w:contextualSpacing/>
+    </w:pPr>
   </w:style>
 </w:styles>
 </file>

</xml_diff>

<commit_message>
Partie Service 2 faite par Adam
</commit_message>
<xml_diff>
--- a/TP2_Flask_Kanban_GitHub.docx
+++ b/TP2_Flask_Kanban_GitHub.docx
@@ -2679,7 +2679,19 @@
         <w:rPr>
           <w:lang w:val="fr-FR"/>
         </w:rPr>
-        <w:t>es collaborateur :</w:t>
+        <w:t>es collaborateur</w:t>
+      </w:r>
+      <w:r>
+        <w:rPr>
+          <w:lang w:val="fr-FR"/>
+        </w:rPr>
+        <w:t>s</w:t>
+      </w:r>
+      <w:r>
+        <w:rPr>
+          <w:lang w:val="fr-FR"/>
+        </w:rPr>
+        <w:t> :</w:t>
       </w:r>
     </w:p>
     <w:p>
@@ -3691,6 +3703,54 @@
     </w:p>
     <w:p>
       <w:pPr>
+        <w:rPr>
+          <w:lang w:val="fr-FR" w:eastAsia="fr-FR" w:bidi="ar-SA"/>
+        </w:rPr>
+      </w:pPr>
+      <w:r>
+        <w:rPr>
+          <w:noProof/>
+          <w:lang w:val="fr-FR" w:eastAsia="fr-FR" w:bidi="ar-SA"/>
+        </w:rPr>
+        <w:drawing>
+          <wp:inline distT="0" distB="0" distL="0" distR="0" wp14:anchorId="501C6591" wp14:editId="101CF0FD">
+            <wp:extent cx="6043295" cy="2903220"/>
+            <wp:effectExtent l="0" t="0" r="0" b="0"/>
+            <wp:docPr id="3" name="Image 3"/>
+            <wp:cNvGraphicFramePr>
+              <a:graphicFrameLocks xmlns:a="http://schemas.openxmlformats.org/drawingml/2006/main" noChangeAspect="1"/>
+            </wp:cNvGraphicFramePr>
+            <a:graphic xmlns:a="http://schemas.openxmlformats.org/drawingml/2006/main">
+              <a:graphicData uri="http://schemas.openxmlformats.org/drawingml/2006/picture">
+                <pic:pic xmlns:pic="http://schemas.openxmlformats.org/drawingml/2006/picture">
+                  <pic:nvPicPr>
+                    <pic:cNvPr id="1" name=""/>
+                    <pic:cNvPicPr/>
+                  </pic:nvPicPr>
+                  <pic:blipFill>
+                    <a:blip r:embed="rId9"/>
+                    <a:stretch>
+                      <a:fillRect/>
+                    </a:stretch>
+                  </pic:blipFill>
+                  <pic:spPr>
+                    <a:xfrm>
+                      <a:off x="0" y="0"/>
+                      <a:ext cx="6043295" cy="2903220"/>
+                    </a:xfrm>
+                    <a:prstGeom prst="rect">
+                      <a:avLst/>
+                    </a:prstGeom>
+                  </pic:spPr>
+                </pic:pic>
+              </a:graphicData>
+            </a:graphic>
+          </wp:inline>
+        </w:drawing>
+      </w:r>
+    </w:p>
+    <w:p>
+      <w:pPr>
         <w:pStyle w:val="Titre5"/>
         <w:pBdr>
           <w:top w:val="single" w:sz="12" w:space="0" w:color="C00000"/>
@@ -4035,6 +4095,7 @@
         <w:rPr>
           <w:lang w:val="fr-FR"/>
         </w:rPr>
+        <w:lastRenderedPageBreak/>
         <w:t>Avant de coder, créez TOUTES les tâches sous forme d'issues GitHub et ajoutez-les au Project. Voici la liste des issues à créer. Chacune doit préciser : titre, description, label, assigné et milestone.</w:t>
       </w:r>
     </w:p>
@@ -4884,7 +4945,6 @@
               <w:rPr>
                 <w:sz w:val="20"/>
               </w:rPr>
-              <w:lastRenderedPageBreak/>
               <w:t>#4</w:t>
             </w:r>
           </w:p>
@@ -5956,7 +6016,17 @@
             </w:tcBorders>
           </w:tcPr>
           <w:p>
-            <w:r>
+            <w:pPr>
+              <w:rPr>
+                <w:sz w:val="20"/>
+                <w:szCs w:val="22"/>
+              </w:rPr>
+            </w:pPr>
+            <w:r>
+              <w:rPr>
+                <w:sz w:val="20"/>
+                <w:szCs w:val="22"/>
+              </w:rPr>
               <w:t>Minh-Tam</w:t>
             </w:r>
           </w:p>
@@ -6913,6 +6983,47 @@
           <w:lang w:val="fr-FR" w:eastAsia="fr-FR" w:bidi="ar-SA"/>
         </w:rPr>
       </w:pPr>
+      <w:r>
+        <w:rPr>
+          <w:noProof/>
+          <w:lang w:val="fr-FR" w:eastAsia="fr-FR" w:bidi="ar-SA"/>
+        </w:rPr>
+        <w:drawing>
+          <wp:inline distT="0" distB="0" distL="0" distR="0" wp14:anchorId="733A7853" wp14:editId="17F94EF0">
+            <wp:extent cx="6043295" cy="2515235"/>
+            <wp:effectExtent l="0" t="0" r="0" b="0"/>
+            <wp:docPr id="4" name="Image 4"/>
+            <wp:cNvGraphicFramePr>
+              <a:graphicFrameLocks xmlns:a="http://schemas.openxmlformats.org/drawingml/2006/main" noChangeAspect="1"/>
+            </wp:cNvGraphicFramePr>
+            <a:graphic xmlns:a="http://schemas.openxmlformats.org/drawingml/2006/main">
+              <a:graphicData uri="http://schemas.openxmlformats.org/drawingml/2006/picture">
+                <pic:pic xmlns:pic="http://schemas.openxmlformats.org/drawingml/2006/picture">
+                  <pic:nvPicPr>
+                    <pic:cNvPr id="1" name=""/>
+                    <pic:cNvPicPr/>
+                  </pic:nvPicPr>
+                  <pic:blipFill>
+                    <a:blip r:embed="rId10"/>
+                    <a:stretch>
+                      <a:fillRect/>
+                    </a:stretch>
+                  </pic:blipFill>
+                  <pic:spPr>
+                    <a:xfrm>
+                      <a:off x="0" y="0"/>
+                      <a:ext cx="6043295" cy="2515235"/>
+                    </a:xfrm>
+                    <a:prstGeom prst="rect">
+                      <a:avLst/>
+                    </a:prstGeom>
+                  </pic:spPr>
+                </pic:pic>
+              </a:graphicData>
+            </a:graphic>
+          </wp:inline>
+        </w:drawing>
+      </w:r>
     </w:p>
     <w:p>
       <w:pPr>
@@ -7166,7 +7277,6 @@
               <w:rPr>
                 <w:sz w:val="20"/>
               </w:rPr>
-              <w:lastRenderedPageBreak/>
               <w:t>main</w:t>
             </w:r>
           </w:p>
@@ -7562,6 +7672,53 @@
         </w:tc>
       </w:tr>
     </w:tbl>
+    <w:p>
+      <w:pPr>
+        <w:pStyle w:val="Titre4"/>
+        <w:ind w:left="-5"/>
+      </w:pPr>
+      <w:r>
+        <w:rPr>
+          <w:noProof/>
+        </w:rPr>
+        <w:lastRenderedPageBreak/>
+        <w:drawing>
+          <wp:inline distT="0" distB="0" distL="0" distR="0" wp14:anchorId="23C52862" wp14:editId="5DAAFBA3">
+            <wp:extent cx="5430008" cy="1790950"/>
+            <wp:effectExtent l="0" t="0" r="0" b="0"/>
+            <wp:docPr id="5" name="Image 5"/>
+            <wp:cNvGraphicFramePr>
+              <a:graphicFrameLocks xmlns:a="http://schemas.openxmlformats.org/drawingml/2006/main" noChangeAspect="1"/>
+            </wp:cNvGraphicFramePr>
+            <a:graphic xmlns:a="http://schemas.openxmlformats.org/drawingml/2006/main">
+              <a:graphicData uri="http://schemas.openxmlformats.org/drawingml/2006/picture">
+                <pic:pic xmlns:pic="http://schemas.openxmlformats.org/drawingml/2006/picture">
+                  <pic:nvPicPr>
+                    <pic:cNvPr id="1" name=""/>
+                    <pic:cNvPicPr/>
+                  </pic:nvPicPr>
+                  <pic:blipFill>
+                    <a:blip r:embed="rId11"/>
+                    <a:stretch>
+                      <a:fillRect/>
+                    </a:stretch>
+                  </pic:blipFill>
+                  <pic:spPr>
+                    <a:xfrm>
+                      <a:off x="0" y="0"/>
+                      <a:ext cx="5430008" cy="1790950"/>
+                    </a:xfrm>
+                    <a:prstGeom prst="rect">
+                      <a:avLst/>
+                    </a:prstGeom>
+                  </pic:spPr>
+                </pic:pic>
+              </a:graphicData>
+            </a:graphic>
+          </wp:inline>
+        </w:drawing>
+      </w:r>
+    </w:p>
     <w:p>
       <w:pPr>
         <w:pStyle w:val="Titre4"/>
@@ -7969,9 +8126,31 @@
       </w:pPr>
       <w:r>
         <w:rPr>
-          <w:lang w:val="fr-FR"/>
-        </w:rPr>
-        <w:t>Q2. Combien de colonnes votre tableau Kanban possède-t-il ? Quelle est la règle WIP ?</w:t>
+          <w:color w:val="FF0000"/>
+          <w:lang w:val="fr-FR"/>
+        </w:rPr>
+        <w:t>Adam est le Chef de projet. Adrien s</w:t>
+      </w:r>
+      <w:r>
+        <w:rPr>
+          <w:color w:val="FF0000"/>
+          <w:lang w:val="fr-FR"/>
+        </w:rPr>
+        <w:t>’occupe du service1 / Adam s’occupe du service2 / Minh-Tam s’occupe du service3</w:t>
+      </w:r>
+      <w:r>
+        <w:rPr>
+          <w:color w:val="FF0000"/>
+          <w:lang w:val="fr-FR"/>
+        </w:rPr>
+        <w:t xml:space="preserve"> et Lokman</w:t>
+      </w:r>
+      <w:r>
+        <w:rPr>
+          <w:color w:val="FF0000"/>
+          <w:lang w:val="fr-FR"/>
+        </w:rPr>
+        <w:t xml:space="preserve"> s’occupe du service4.</w:t>
       </w:r>
     </w:p>
     <w:p>
@@ -7991,7 +8170,60 @@
         <w:rPr>
           <w:lang w:val="fr-FR"/>
         </w:rPr>
-        <w:t>Q3. Quelle est la différence entre la branche main et la branche develop ?</w:t>
+        <w:t>Q2. Combien de colonnes votre tableau Kanban possède-t-il ? Quelle est la règle WIP ?</w:t>
+      </w:r>
+    </w:p>
+    <w:p>
+      <w:pPr>
+        <w:spacing w:after="4" w:line="261" w:lineRule="auto"/>
+        <w:ind w:left="705" w:right="14"/>
+        <w:jc w:val="both"/>
+        <w:rPr>
+          <w:color w:val="FF0000"/>
+          <w:lang w:val="fr-FR"/>
+        </w:rPr>
+      </w:pPr>
+      <w:r>
+        <w:rPr>
+          <w:color w:val="FF0000"/>
+          <w:lang w:val="fr-FR"/>
+        </w:rPr>
+        <w:t>Il y a 6 colonnes dans notre tableau Kanban</w:t>
+      </w:r>
+      <w:r>
+        <w:rPr>
+          <w:color w:val="FF0000"/>
+          <w:lang w:val="fr-FR"/>
+        </w:rPr>
+        <w:t xml:space="preserve">. </w:t>
+      </w:r>
+      <w:r>
+        <w:rPr>
+          <w:color w:val="FF0000"/>
+          <w:lang w:val="fr-FR"/>
+        </w:rPr>
+        <w:t>La limite WIP (Work In Progress) est fixée à 1 tâche « En cours » par étudiant à la fois. Fini</w:t>
+      </w:r>
+      <w:r>
+        <w:rPr>
+          <w:color w:val="FF0000"/>
+          <w:lang w:val="fr-FR"/>
+        </w:rPr>
+        <w:t xml:space="preserve">r </w:t>
+      </w:r>
+      <w:r>
+        <w:rPr>
+          <w:color w:val="FF0000"/>
+          <w:lang w:val="fr-FR"/>
+        </w:rPr>
+        <w:t xml:space="preserve">ce que nous avons commencer </w:t>
+      </w:r>
+      <w:r>
+        <w:rPr>
+          <w:color w:val="FF0000"/>
+          <w:lang w:val="fr-FR"/>
+        </w:rPr>
+        <w:t>avant de choisir une autre tâche.</w:t>
       </w:r>
     </w:p>
     <w:p>
@@ -8011,7 +8243,7 @@
         <w:rPr>
           <w:lang w:val="fr-FR"/>
         </w:rPr>
-        <w:t>Q4. Quel est le format d'un bon message de commit pour ce projet ?</w:t>
+        <w:t>Q3. Quelle est la différence entre la branche main et la branche develop ?</w:t>
       </w:r>
     </w:p>
     <w:p>
@@ -8029,9 +8261,111 @@
       </w:pPr>
       <w:r>
         <w:rPr>
+          <w:color w:val="FF0000"/>
+          <w:lang w:val="fr-FR"/>
+        </w:rPr>
+        <w:t xml:space="preserve">La branche develop est la ou a toute la partie dev et les test qui </w:t>
+      </w:r>
+      <w:r>
+        <w:rPr>
+          <w:color w:val="FF0000"/>
+          <w:lang w:val="fr-FR"/>
+        </w:rPr>
+        <w:t>ont réussi alors que main est la branche finale ou on rend le projet sur cette branche.</w:t>
+      </w:r>
+    </w:p>
+    <w:p>
+      <w:pPr>
+        <w:numPr>
+          <w:ilvl w:val="0"/>
+          <w:numId w:val="6"/>
+        </w:numPr>
+        <w:spacing w:after="4" w:line="261" w:lineRule="auto"/>
+        <w:ind w:right="14" w:hanging="360"/>
+        <w:jc w:val="both"/>
+        <w:rPr>
+          <w:lang w:val="fr-FR"/>
+        </w:rPr>
+      </w:pPr>
+      <w:r>
+        <w:rPr>
+          <w:lang w:val="fr-FR"/>
+        </w:rPr>
+        <w:t>Q4. Quel est le format d'un bon message de commit pour ce projet ?</w:t>
+      </w:r>
+      <w:r>
+        <w:rPr>
+          <w:rFonts w:ascii="Courier New" w:eastAsia="Courier New" w:hAnsi="Courier New" w:cs="Courier New"/>
+          <w:color w:val="00FF7F"/>
+          <w:sz w:val="18"/>
+          <w:lang w:val="fr-FR"/>
+        </w:rPr>
+        <w:t xml:space="preserve"> </w:t>
+      </w:r>
+    </w:p>
+    <w:p>
+      <w:pPr>
+        <w:spacing w:after="4" w:line="261" w:lineRule="auto"/>
+        <w:ind w:left="705" w:right="14"/>
+        <w:jc w:val="both"/>
+        <w:rPr>
+          <w:color w:val="FF0000"/>
+          <w:lang w:val="fr-FR"/>
+        </w:rPr>
+      </w:pPr>
+      <w:r>
+        <w:rPr>
+          <w:color w:val="FF0000"/>
+          <w:lang w:val="fr-FR"/>
+        </w:rPr>
+        <w:t>« le type de modif »</w:t>
+      </w:r>
+      <w:r>
+        <w:rPr>
+          <w:color w:val="FF0000"/>
+          <w:lang w:val="fr-FR"/>
+        </w:rPr>
+        <w:t> « le service » : « une description de l’action faites »</w:t>
+      </w:r>
+    </w:p>
+    <w:p>
+      <w:pPr>
+        <w:numPr>
+          <w:ilvl w:val="0"/>
+          <w:numId w:val="6"/>
+        </w:numPr>
+        <w:spacing w:after="4" w:line="261" w:lineRule="auto"/>
+        <w:ind w:right="14" w:hanging="360"/>
+        <w:jc w:val="both"/>
+        <w:rPr>
+          <w:lang w:val="fr-FR"/>
+        </w:rPr>
+      </w:pPr>
+      <w:r>
+        <w:rPr>
           <w:lang w:val="fr-FR"/>
         </w:rPr>
         <w:t>Q5. Combien d'issues avez-vous créées dans GitHub ? Sont-elles toutes assignées et dans le Project ?</w:t>
+      </w:r>
+      <w:r>
+        <w:rPr>
+          <w:lang w:val="fr-FR"/>
+        </w:rPr>
+        <w:t xml:space="preserve"> </w:t>
+      </w:r>
+      <w:r>
+        <w:rPr>
+          <w:color w:val="FF0000"/>
+          <w:lang w:val="fr-FR"/>
+        </w:rPr>
+        <w:t>On en a créer 17 issues sur GitHub</w:t>
+      </w:r>
+      <w:r>
+        <w:rPr>
+          <w:color w:val="FF0000"/>
+          <w:lang w:val="fr-FR"/>
+        </w:rPr>
+        <w:t>.</w:t>
       </w:r>
     </w:p>
     <w:p>
@@ -8067,6 +8401,7 @@
         <w:ind w:left="135"/>
       </w:pPr>
       <w:r>
+        <w:lastRenderedPageBreak/>
         <w:t>Étape 2.1 — Environnement et dépendances</w:t>
       </w:r>
     </w:p>
@@ -8266,7 +8601,6 @@
                 <w:sz w:val="18"/>
                 <w:lang w:val="fr-FR"/>
               </w:rPr>
-              <w:lastRenderedPageBreak/>
               <w:t># Naviguer dans le dossier du service cd service1_matrices</w:t>
             </w:r>
           </w:p>
@@ -10899,10 +11233,95 @@
     </w:p>
     <w:p>
       <w:pPr>
+        <w:rPr>
+          <w:lang w:val="fr-FR" w:eastAsia="fr-FR" w:bidi="ar-SA"/>
+        </w:rPr>
+      </w:pPr>
+      <w:r>
+        <w:rPr>
+          <w:lang w:val="fr-FR" w:eastAsia="fr-FR" w:bidi="ar-SA"/>
+        </w:rPr>
+        <w:lastRenderedPageBreak/>
+        <w:drawing>
+          <wp:inline distT="0" distB="0" distL="0" distR="0" wp14:anchorId="0B574EBB" wp14:editId="7453F312">
+            <wp:extent cx="6043295" cy="6531610"/>
+            <wp:effectExtent l="0" t="0" r="0" b="2540"/>
+            <wp:docPr id="6" name="Image 6"/>
+            <wp:cNvGraphicFramePr>
+              <a:graphicFrameLocks xmlns:a="http://schemas.openxmlformats.org/drawingml/2006/main" noChangeAspect="1"/>
+            </wp:cNvGraphicFramePr>
+            <a:graphic xmlns:a="http://schemas.openxmlformats.org/drawingml/2006/main">
+              <a:graphicData uri="http://schemas.openxmlformats.org/drawingml/2006/picture">
+                <pic:pic xmlns:pic="http://schemas.openxmlformats.org/drawingml/2006/picture">
+                  <pic:nvPicPr>
+                    <pic:cNvPr id="1" name=""/>
+                    <pic:cNvPicPr/>
+                  </pic:nvPicPr>
+                  <pic:blipFill>
+                    <a:blip r:embed="rId12"/>
+                    <a:stretch>
+                      <a:fillRect/>
+                    </a:stretch>
+                  </pic:blipFill>
+                  <pic:spPr>
+                    <a:xfrm>
+                      <a:off x="0" y="0"/>
+                      <a:ext cx="6043295" cy="6531610"/>
+                    </a:xfrm>
+                    <a:prstGeom prst="rect">
+                      <a:avLst/>
+                    </a:prstGeom>
+                  </pic:spPr>
+                </pic:pic>
+              </a:graphicData>
+            </a:graphic>
+          </wp:inline>
+        </w:drawing>
+      </w:r>
+    </w:p>
+    <w:p>
+      <w:pPr>
         <w:pStyle w:val="Titre5"/>
         <w:spacing w:after="61"/>
         <w:ind w:left="-5" w:right="2323"/>
       </w:pPr>
+      <w:r>
+        <w:drawing>
+          <wp:inline distT="0" distB="0" distL="0" distR="0" wp14:anchorId="74413228" wp14:editId="3997DFEA">
+            <wp:extent cx="6043295" cy="1438910"/>
+            <wp:effectExtent l="0" t="0" r="0" b="8890"/>
+            <wp:docPr id="7" name="Image 7"/>
+            <wp:cNvGraphicFramePr>
+              <a:graphicFrameLocks xmlns:a="http://schemas.openxmlformats.org/drawingml/2006/main" noChangeAspect="1"/>
+            </wp:cNvGraphicFramePr>
+            <a:graphic xmlns:a="http://schemas.openxmlformats.org/drawingml/2006/main">
+              <a:graphicData uri="http://schemas.openxmlformats.org/drawingml/2006/picture">
+                <pic:pic xmlns:pic="http://schemas.openxmlformats.org/drawingml/2006/picture">
+                  <pic:nvPicPr>
+                    <pic:cNvPr id="1" name=""/>
+                    <pic:cNvPicPr/>
+                  </pic:nvPicPr>
+                  <pic:blipFill>
+                    <a:blip r:embed="rId13"/>
+                    <a:stretch>
+                      <a:fillRect/>
+                    </a:stretch>
+                  </pic:blipFill>
+                  <pic:spPr>
+                    <a:xfrm>
+                      <a:off x="0" y="0"/>
+                      <a:ext cx="6043295" cy="1438910"/>
+                    </a:xfrm>
+                    <a:prstGeom prst="rect">
+                      <a:avLst/>
+                    </a:prstGeom>
+                  </pic:spPr>
+                </pic:pic>
+              </a:graphicData>
+            </a:graphic>
+          </wp:inline>
+        </w:drawing>
+      </w:r>
     </w:p>
     <w:p>
       <w:pPr>
@@ -10971,6 +11390,7 @@
                 <w:color w:val="00FF7F"/>
                 <w:sz w:val="18"/>
               </w:rPr>
+              <w:lastRenderedPageBreak/>
               <w:t>@app.route('/stats/correlation', methods=['POST']) def correlation():</w:t>
             </w:r>
           </w:p>
@@ -11139,6 +11559,53 @@
           <w:lang w:val="fr-FR" w:eastAsia="fr-FR" w:bidi="ar-SA"/>
         </w:rPr>
         <w:t>Après avoir fait les tests avec postman écrire du code pour faire un test unitaire en HTML/JSON et Python de la partie client</w:t>
+      </w:r>
+    </w:p>
+    <w:p>
+      <w:pPr>
+        <w:rPr>
+          <w:lang w:val="fr-FR" w:eastAsia="fr-FR" w:bidi="ar-SA"/>
+        </w:rPr>
+      </w:pPr>
+      <w:r>
+        <w:rPr>
+          <w:lang w:val="fr-FR" w:eastAsia="fr-FR" w:bidi="ar-SA"/>
+        </w:rPr>
+        <w:drawing>
+          <wp:inline distT="0" distB="0" distL="0" distR="0" wp14:anchorId="1D71DBF9" wp14:editId="713C871E">
+            <wp:extent cx="6043295" cy="1097915"/>
+            <wp:effectExtent l="0" t="0" r="0" b="6985"/>
+            <wp:docPr id="8" name="Image 8"/>
+            <wp:cNvGraphicFramePr>
+              <a:graphicFrameLocks xmlns:a="http://schemas.openxmlformats.org/drawingml/2006/main" noChangeAspect="1"/>
+            </wp:cNvGraphicFramePr>
+            <a:graphic xmlns:a="http://schemas.openxmlformats.org/drawingml/2006/main">
+              <a:graphicData uri="http://schemas.openxmlformats.org/drawingml/2006/picture">
+                <pic:pic xmlns:pic="http://schemas.openxmlformats.org/drawingml/2006/picture">
+                  <pic:nvPicPr>
+                    <pic:cNvPr id="1" name=""/>
+                    <pic:cNvPicPr/>
+                  </pic:nvPicPr>
+                  <pic:blipFill>
+                    <a:blip r:embed="rId14"/>
+                    <a:stretch>
+                      <a:fillRect/>
+                    </a:stretch>
+                  </pic:blipFill>
+                  <pic:spPr>
+                    <a:xfrm>
+                      <a:off x="0" y="0"/>
+                      <a:ext cx="6043295" cy="1097915"/>
+                    </a:xfrm>
+                    <a:prstGeom prst="rect">
+                      <a:avLst/>
+                    </a:prstGeom>
+                  </pic:spPr>
+                </pic:pic>
+              </a:graphicData>
+            </a:graphic>
+          </wp:inline>
+        </w:drawing>
       </w:r>
     </w:p>
     <w:p>
@@ -11244,6 +11711,7 @@
                 <w:color w:val="00FF7F"/>
                 <w:sz w:val="18"/>
               </w:rPr>
+              <w:lastRenderedPageBreak/>
               <w:t xml:space="preserve">    try:</w:t>
             </w:r>
           </w:p>
@@ -11389,6 +11857,53 @@
           <w:lang w:val="fr-FR" w:eastAsia="fr-FR" w:bidi="ar-SA"/>
         </w:rPr>
         <w:t>Après avoir fait les tests avec postman écrire du code pour faire un test unitaire en HTML/JSON et Python de la partie client</w:t>
+      </w:r>
+    </w:p>
+    <w:p>
+      <w:pPr>
+        <w:rPr>
+          <w:lang w:val="fr-FR" w:eastAsia="fr-FR" w:bidi="ar-SA"/>
+        </w:rPr>
+      </w:pPr>
+      <w:r>
+        <w:rPr>
+          <w:lang w:val="fr-FR" w:eastAsia="fr-FR" w:bidi="ar-SA"/>
+        </w:rPr>
+        <w:drawing>
+          <wp:inline distT="0" distB="0" distL="0" distR="0" wp14:anchorId="172F8CA3" wp14:editId="3954428B">
+            <wp:extent cx="6043295" cy="1087120"/>
+            <wp:effectExtent l="0" t="0" r="0" b="0"/>
+            <wp:docPr id="9" name="Image 9"/>
+            <wp:cNvGraphicFramePr>
+              <a:graphicFrameLocks xmlns:a="http://schemas.openxmlformats.org/drawingml/2006/main" noChangeAspect="1"/>
+            </wp:cNvGraphicFramePr>
+            <a:graphic xmlns:a="http://schemas.openxmlformats.org/drawingml/2006/main">
+              <a:graphicData uri="http://schemas.openxmlformats.org/drawingml/2006/picture">
+                <pic:pic xmlns:pic="http://schemas.openxmlformats.org/drawingml/2006/picture">
+                  <pic:nvPicPr>
+                    <pic:cNvPr id="1" name=""/>
+                    <pic:cNvPicPr/>
+                  </pic:nvPicPr>
+                  <pic:blipFill>
+                    <a:blip r:embed="rId15"/>
+                    <a:stretch>
+                      <a:fillRect/>
+                    </a:stretch>
+                  </pic:blipFill>
+                  <pic:spPr>
+                    <a:xfrm>
+                      <a:off x="0" y="0"/>
+                      <a:ext cx="6043295" cy="1087120"/>
+                    </a:xfrm>
+                    <a:prstGeom prst="rect">
+                      <a:avLst/>
+                    </a:prstGeom>
+                  </pic:spPr>
+                </pic:pic>
+              </a:graphicData>
+            </a:graphic>
+          </wp:inline>
+        </w:drawing>
       </w:r>
     </w:p>
     <w:p>
@@ -12010,6 +12525,7 @@
           <w:p>
             <w:pPr>
               <w:rPr>
+                <w:sz w:val="20"/>
                 <w:lang w:val="fr-FR"/>
               </w:rPr>
             </w:pPr>
@@ -12020,6 +12536,13 @@
               </w:rPr>
               <w:t>Passer #10 après merge PR de #9</w:t>
             </w:r>
+          </w:p>
+          <w:p>
+            <w:pPr>
+              <w:rPr>
+                <w:lang w:val="fr-FR"/>
+              </w:rPr>
+            </w:pPr>
           </w:p>
         </w:tc>
       </w:tr>
@@ -12860,7 +13383,7 @@
         <w:spacing w:after="59" w:line="334" w:lineRule="auto"/>
         <w:ind w:left="175" w:right="2209" w:hanging="10"/>
         <w:rPr>
-          <w:lang w:val="en-GB"/>
+          <w:lang w:val="fr-FR"/>
         </w:rPr>
       </w:pPr>
       <w:r>
@@ -12868,7 +13391,7 @@
           <w:rFonts w:ascii="Courier New" w:eastAsia="Courier New" w:hAnsi="Courier New" w:cs="Courier New"/>
           <w:color w:val="00FF7F"/>
           <w:sz w:val="18"/>
-          <w:lang w:val="en-GB"/>
+          <w:lang w:val="fr-FR"/>
         </w:rPr>
         <w:t>cd service3_stats_mysql python -m venv venv &amp;&amp; source venv/bin/activate pip install flask mysql-connector-python numpy scipy python-dotenv pip freeze &gt; requirements.txt</w:t>
       </w:r>
@@ -12879,7 +13402,7 @@
         <w:ind w:left="10" w:right="14" w:hanging="10"/>
         <w:jc w:val="both"/>
         <w:rPr>
-          <w:lang w:val="en-GB"/>
+          <w:lang w:val="fr-FR"/>
         </w:rPr>
       </w:pPr>
     </w:p>
@@ -12999,12 +13522,16 @@
         <w:shd w:val="clear" w:color="auto" w:fill="2C3E50"/>
         <w:spacing w:after="482" w:line="265" w:lineRule="auto"/>
         <w:ind w:left="175" w:hanging="10"/>
+        <w:rPr>
+          <w:lang w:val="fr-FR"/>
+        </w:rPr>
       </w:pPr>
       <w:r>
         <w:rPr>
           <w:rFonts w:ascii="Courier New" w:eastAsia="Courier New" w:hAnsi="Courier New" w:cs="Courier New"/>
           <w:color w:val="00FF7F"/>
           <w:sz w:val="18"/>
+          <w:lang w:val="fr-FR"/>
         </w:rPr>
         <w:t>DB_NAME=flask_stats</w:t>
       </w:r>
@@ -15492,7 +16019,7 @@
         <w:spacing w:after="606" w:line="334" w:lineRule="auto"/>
         <w:ind w:left="175" w:right="2749" w:hanging="10"/>
         <w:rPr>
-          <w:lang w:val="en-GB"/>
+          <w:lang w:val="fr-FR"/>
         </w:rPr>
       </w:pPr>
       <w:r>
@@ -15500,7 +16027,7 @@
           <w:rFonts w:ascii="Courier New" w:eastAsia="Courier New" w:hAnsi="Courier New" w:cs="Courier New"/>
           <w:color w:val="00FF7F"/>
           <w:sz w:val="18"/>
-          <w:lang w:val="en-GB"/>
+          <w:lang w:val="fr-FR"/>
         </w:rPr>
         <w:t>cd service4_csv_mysql python -m venv venv &amp;&amp; source venv/bin/activate pip install flask pandas mysql-connector-python python-dotenv pip freeze &gt; requirements.txt</w:t>
       </w:r>
@@ -15916,6 +16443,9 @@
           <w:p>
             <w:pPr>
               <w:spacing w:after="63"/>
+              <w:rPr>
+                <w:lang w:val="fr-FR"/>
+              </w:rPr>
             </w:pPr>
             <w:r>
               <w:rPr>
@@ -15931,6 +16461,7 @@
                 <w:rFonts w:ascii="Courier New" w:eastAsia="Courier New" w:hAnsi="Courier New" w:cs="Courier New"/>
                 <w:color w:val="00FF7F"/>
                 <w:sz w:val="18"/>
+                <w:lang w:val="fr-FR"/>
               </w:rPr>
               <w:t>'manquantes': list(colonnes_manquantes)</w:t>
             </w:r>
@@ -15938,12 +16469,16 @@
           <w:p>
             <w:pPr>
               <w:spacing w:after="396"/>
-            </w:pPr>
-            <w:r>
-              <w:rPr>
-                <w:rFonts w:ascii="Courier New" w:eastAsia="Courier New" w:hAnsi="Courier New" w:cs="Courier New"/>
-                <w:color w:val="00FF7F"/>
-                <w:sz w:val="18"/>
+              <w:rPr>
+                <w:lang w:val="fr-FR"/>
+              </w:rPr>
+            </w:pPr>
+            <w:r>
+              <w:rPr>
+                <w:rFonts w:ascii="Courier New" w:eastAsia="Courier New" w:hAnsi="Courier New" w:cs="Courier New"/>
+                <w:color w:val="00FF7F"/>
+                <w:sz w:val="18"/>
+                <w:lang w:val="fr-FR"/>
               </w:rPr>
               <w:t xml:space="preserve">        }), 400</w:t>
             </w:r>
@@ -15952,12 +16487,16 @@
             <w:pPr>
               <w:spacing w:after="333" w:line="334" w:lineRule="auto"/>
               <w:ind w:right="1858"/>
-            </w:pPr>
-            <w:r>
-              <w:rPr>
-                <w:rFonts w:ascii="Courier New" w:eastAsia="Courier New" w:hAnsi="Courier New" w:cs="Courier New"/>
-                <w:color w:val="00FF7F"/>
-                <w:sz w:val="18"/>
+              <w:rPr>
+                <w:lang w:val="fr-FR"/>
+              </w:rPr>
+            </w:pPr>
+            <w:r>
+              <w:rPr>
+                <w:rFonts w:ascii="Courier New" w:eastAsia="Courier New" w:hAnsi="Courier New" w:cs="Courier New"/>
+                <w:color w:val="00FF7F"/>
+                <w:sz w:val="18"/>
+                <w:lang w:val="fr-FR"/>
               </w:rPr>
               <w:t xml:space="preserve">    # 4. Nettoyer les données     df = df[[c for c in df.columns if c in COLONNES_VALIDES]]     df['valeur'] = pd.to_numeric(df['valeur'], errors='coerce')     lignes_invalides = df['valeur'].isna().sum()     df.dropna(subset=['valeur'], inplace=True)</w:t>
             </w:r>
@@ -15975,6 +16514,7 @@
                 <w:rFonts w:ascii="Courier New" w:eastAsia="Courier New" w:hAnsi="Courier New" w:cs="Courier New"/>
                 <w:color w:val="00FF7F"/>
                 <w:sz w:val="18"/>
+                <w:lang w:val="fr-FR"/>
               </w:rPr>
               <w:t xml:space="preserve">    </w:t>
             </w:r>
@@ -16143,12 +16683,16 @@
           <w:p>
             <w:pPr>
               <w:spacing w:after="396"/>
-            </w:pPr>
-            <w:r>
-              <w:rPr>
-                <w:rFonts w:ascii="Courier New" w:eastAsia="Courier New" w:hAnsi="Courier New" w:cs="Courier New"/>
-                <w:color w:val="00FF7F"/>
-                <w:sz w:val="18"/>
+              <w:rPr>
+                <w:lang w:val="fr-FR"/>
+              </w:rPr>
+            </w:pPr>
+            <w:r>
+              <w:rPr>
+                <w:rFonts w:ascii="Courier New" w:eastAsia="Courier New" w:hAnsi="Courier New" w:cs="Courier New"/>
+                <w:color w:val="00FF7F"/>
+                <w:sz w:val="18"/>
+                <w:lang w:val="fr-FR"/>
               </w:rPr>
               <w:t>500</w:t>
             </w:r>
@@ -16166,6 +16710,7 @@
                 <w:rFonts w:ascii="Courier New" w:eastAsia="Courier New" w:hAnsi="Courier New" w:cs="Courier New"/>
                 <w:color w:val="00FF7F"/>
                 <w:sz w:val="18"/>
+                <w:lang w:val="fr-FR"/>
               </w:rPr>
               <w:t xml:space="preserve">    </w:t>
             </w:r>
@@ -19719,15 +20264,15 @@
             <w:pPr>
               <w:spacing w:after="396"/>
               <w:rPr>
-                <w:lang w:val="fr-FR"/>
-              </w:rPr>
-            </w:pPr>
-            <w:r>
-              <w:rPr>
-                <w:rFonts w:ascii="Courier New" w:eastAsia="Courier New" w:hAnsi="Courier New" w:cs="Courier New"/>
-                <w:color w:val="00FF7F"/>
-                <w:sz w:val="18"/>
-                <w:lang w:val="fr-FR"/>
+                <w:lang w:val="en-GB"/>
+              </w:rPr>
+            </w:pPr>
+            <w:r>
+              <w:rPr>
+                <w:rFonts w:ascii="Courier New" w:eastAsia="Courier New" w:hAnsi="Courier New" w:cs="Courier New"/>
+                <w:color w:val="00FF7F"/>
+                <w:sz w:val="18"/>
+                <w:lang w:val="en-GB"/>
               </w:rPr>
               <w:t>OUT_FILE="${LIB_DIR}/stats.so"</w:t>
             </w:r>
@@ -20394,12 +20939,16 @@
             <w:pPr>
               <w:spacing w:after="333" w:line="334" w:lineRule="auto"/>
               <w:ind w:right="4342"/>
-            </w:pPr>
-            <w:r>
-              <w:rPr>
-                <w:rFonts w:ascii="Courier New" w:eastAsia="Courier New" w:hAnsi="Courier New" w:cs="Courier New"/>
-                <w:color w:val="00FF7F"/>
-                <w:sz w:val="18"/>
+              <w:rPr>
+                <w:lang w:val="fr-FR"/>
+              </w:rPr>
+            </w:pPr>
+            <w:r>
+              <w:rPr>
+                <w:rFonts w:ascii="Courier New" w:eastAsia="Courier New" w:hAnsi="Courier New" w:cs="Courier New"/>
+                <w:color w:val="00FF7F"/>
+                <w:sz w:val="18"/>
+                <w:lang w:val="fr-FR"/>
               </w:rPr>
               <w:t># c_bridge.py — Pont Python/C via ctypes import ctypes import os import platform</w:t>
             </w:r>
@@ -20408,22 +20957,32 @@
             <w:pPr>
               <w:spacing w:after="333" w:line="334" w:lineRule="auto"/>
               <w:ind w:right="1534"/>
-            </w:pPr>
-            <w:r>
-              <w:rPr>
-                <w:rFonts w:ascii="Courier New" w:eastAsia="Courier New" w:hAnsi="Courier New" w:cs="Courier New"/>
-                <w:color w:val="00FF7F"/>
-                <w:sz w:val="18"/>
+              <w:rPr>
+                <w:lang w:val="fr-FR"/>
+              </w:rPr>
+            </w:pPr>
+            <w:r>
+              <w:rPr>
+                <w:rFonts w:ascii="Courier New" w:eastAsia="Courier New" w:hAnsi="Courier New" w:cs="Courier New"/>
+                <w:color w:val="00FF7F"/>
+                <w:sz w:val="18"/>
+                <w:lang w:val="fr-FR"/>
               </w:rPr>
               <w:t># ─── Chargement de la bibliothèque ────────────────────────────── # Déterminer le nom du fichier selon le système d'exploitation _ext = '.so' if platform.system() == 'Darwin':   # macOS     _ext = '.dylib' elif platform.system() == 'Windows':     _ext = '.dll'</w:t>
             </w:r>
           </w:p>
           <w:p>
-            <w:r>
-              <w:rPr>
-                <w:rFonts w:ascii="Courier New" w:eastAsia="Courier New" w:hAnsi="Courier New" w:cs="Courier New"/>
-                <w:color w:val="00FF7F"/>
-                <w:sz w:val="18"/>
+            <w:pPr>
+              <w:rPr>
+                <w:lang w:val="fr-FR"/>
+              </w:rPr>
+            </w:pPr>
+            <w:r>
+              <w:rPr>
+                <w:rFonts w:ascii="Courier New" w:eastAsia="Courier New" w:hAnsi="Courier New" w:cs="Courier New"/>
+                <w:color w:val="00FF7F"/>
+                <w:sz w:val="18"/>
+                <w:lang w:val="fr-FR"/>
               </w:rPr>
               <w:t>_lib_path = os.path.join(os.path.dirname(__file__), 'lib', f'stats{_ext}')</w:t>
             </w:r>
@@ -20435,6 +20994,9 @@
       <w:pPr>
         <w:spacing w:after="0"/>
         <w:ind w:left="-1202" w:right="560"/>
+        <w:rPr>
+          <w:lang w:val="fr-FR"/>
+        </w:rPr>
       </w:pPr>
     </w:p>
     <w:tbl>
@@ -23213,16 +23775,12 @@
             <w:pPr>
               <w:spacing w:line="334" w:lineRule="auto"/>
               <w:ind w:right="3478"/>
-              <w:rPr>
-                <w:lang w:val="fr-FR"/>
-              </w:rPr>
-            </w:pPr>
-            <w:r>
-              <w:rPr>
-                <w:rFonts w:ascii="Courier New" w:eastAsia="Courier New" w:hAnsi="Courier New" w:cs="Courier New"/>
-                <w:color w:val="00FF7F"/>
-                <w:sz w:val="18"/>
-                <w:lang w:val="fr-FR"/>
+            </w:pPr>
+            <w:r>
+              <w:rPr>
+                <w:rFonts w:ascii="Courier New" w:eastAsia="Courier New" w:hAnsi="Courier New" w:cs="Courier New"/>
+                <w:color w:val="00FF7F"/>
+                <w:sz w:val="18"/>
               </w:rPr>
               <w:t># Test 2 : Produit scalaire curl -X POST http://localhost:5005/c/stats/dot \      -H 'Content-Type: application/json' \</w:t>
             </w:r>
@@ -23230,13 +23788,15 @@
           <w:p>
             <w:pPr>
               <w:spacing w:after="63"/>
-            </w:pPr>
-            <w:r>
-              <w:rPr>
-                <w:rFonts w:ascii="Courier New" w:eastAsia="Courier New" w:hAnsi="Courier New" w:cs="Courier New"/>
-                <w:color w:val="00FF7F"/>
-                <w:sz w:val="18"/>
-                <w:lang w:val="fr-FR"/>
+              <w:rPr>
+                <w:lang w:val="fr-FR"/>
+              </w:rPr>
+            </w:pPr>
+            <w:r>
+              <w:rPr>
+                <w:rFonts w:ascii="Courier New" w:eastAsia="Courier New" w:hAnsi="Courier New" w:cs="Courier New"/>
+                <w:color w:val="00FF7F"/>
+                <w:sz w:val="18"/>
               </w:rPr>
               <w:t xml:space="preserve">     </w:t>
             </w:r>
@@ -23245,6 +23805,7 @@
                 <w:rFonts w:ascii="Courier New" w:eastAsia="Courier New" w:hAnsi="Courier New" w:cs="Courier New"/>
                 <w:color w:val="00FF7F"/>
                 <w:sz w:val="18"/>
+                <w:lang w:val="fr-FR"/>
               </w:rPr>
               <w:t>-d '{"v1": [1, 2, 3], "v2": [4, 5, 6]}'</w:t>
             </w:r>
@@ -23361,12 +23922,16 @@
             <w:pPr>
               <w:spacing w:after="333" w:line="334" w:lineRule="auto"/>
               <w:ind w:right="3586"/>
-            </w:pPr>
-            <w:r>
-              <w:rPr>
-                <w:rFonts w:ascii="Courier New" w:eastAsia="Courier New" w:hAnsi="Courier New" w:cs="Courier New"/>
-                <w:color w:val="00FF7F"/>
-                <w:sz w:val="18"/>
+              <w:rPr>
+                <w:lang w:val="fr-FR"/>
+              </w:rPr>
+            </w:pPr>
+            <w:r>
+              <w:rPr>
+                <w:rFonts w:ascii="Courier New" w:eastAsia="Courier New" w:hAnsi="Courier New" w:cs="Courier New"/>
+                <w:color w:val="00FF7F"/>
+                <w:sz w:val="18"/>
+                <w:lang w:val="fr-FR"/>
               </w:rPr>
               <w:t># benchmark.py — Compare Python pur vs C/ctypes import time import c_bridge as C import random</w:t>
             </w:r>
@@ -30463,12 +31028,12 @@
       </w:pPr>
     </w:p>
     <w:sectPr>
-      <w:headerReference w:type="even" r:id="rId9"/>
-      <w:headerReference w:type="default" r:id="rId10"/>
-      <w:footerReference w:type="even" r:id="rId11"/>
-      <w:footerReference w:type="default" r:id="rId12"/>
-      <w:headerReference w:type="first" r:id="rId13"/>
-      <w:footerReference w:type="first" r:id="rId14"/>
+      <w:headerReference w:type="even" r:id="rId16"/>
+      <w:headerReference w:type="default" r:id="rId17"/>
+      <w:footerReference w:type="even" r:id="rId18"/>
+      <w:footerReference w:type="default" r:id="rId19"/>
+      <w:headerReference w:type="first" r:id="rId20"/>
+      <w:footerReference w:type="first" r:id="rId21"/>
       <w:pgSz w:w="11906" w:h="16838"/>
       <w:pgMar w:top="1200" w:right="1187" w:bottom="1211" w:left="1202" w:header="714" w:footer="708" w:gutter="0"/>
       <w:cols w:space="720"/>
@@ -34543,6 +35108,7 @@
   <w:style w:type="paragraph" w:default="1" w:styleId="Normal">
     <w:name w:val="Normal"/>
     <w:qFormat/>
+    <w:rsid w:val="00557933"/>
     <w:pPr>
       <w:spacing w:line="259" w:lineRule="auto"/>
     </w:pPr>
@@ -34773,6 +35339,17 @@
     <w:name w:val="token"/>
     <w:basedOn w:val="Policepardfaut"/>
     <w:rsid w:val="00AA5DE6"/>
+  </w:style>
+  <w:style w:type="paragraph" w:styleId="Paragraphedeliste">
+    <w:name w:val="List Paragraph"/>
+    <w:basedOn w:val="Normal"/>
+    <w:uiPriority w:val="34"/>
+    <w:qFormat/>
+    <w:rsid w:val="00557933"/>
+    <w:pPr>
+      <w:ind w:left="720"/>
+      <w:contextualSpacing/>
+    </w:pPr>
   </w:style>
 </w:styles>
 </file>

</xml_diff>